<commit_message>
Integrar fundamentos y separar anexo del instructor
</commit_message>
<xml_diff>
--- a/practica/Practica_control_pO2.docx
+++ b/practica/Practica_control_pO2.docx
@@ -21,7 +21,7 @@
           <w:sz w:val="24"/>
           <w:szCs w:val="24"/>
         </w:rPr>
-        <w:t xml:space="preserve">Emiliano Balderas · Instituto de Biotecnología, UNAM</w:t>
+        <w:t xml:space="preserve">Octavio T. Ramírez · Emiliano Balderas · Instituto de Biotecnología, UNAM</w:t>
       </w:r>
     </w:p>
     <w:p>
@@ -95,14 +95,14 @@
         <w:t xml:space="preserve">Sartorius Biostat B, vasija de 8 L</w:t>
       </w:r>
     </w:p>
-    <w:bookmarkStart w:id="9" w:name="X5d53ff30d5614244ce42ad163d4ca98093cad69"/>
+    <w:bookmarkStart w:id="9" w:name="control-de-oxígeno-disuelto"/>
     <w:p>
       <w:pPr>
         <w:pStyle w:val="Heading1"/>
         <w:jc w:val="both"/>
       </w:pPr>
       <w:r>
-        <w:t xml:space="preserve">1. ¿Qué es el control y por qué importa en bioprocesos?</w:t>
+        <w:t xml:space="preserve">1. Control de oxígeno disuelto</w:t>
       </w:r>
     </w:p>
     <w:p>
@@ -642,14 +642,14 @@
       </w:r>
     </w:p>
     <w:bookmarkEnd w:id="9"/>
-    <w:bookmarkStart w:id="12" w:name="un-tipo-de-controlador-el-pid"/>
+    <w:bookmarkStart w:id="12" w:name="controlador-pid-y-operación-pi"/>
     <w:p>
       <w:pPr>
         <w:pStyle w:val="Heading1"/>
         <w:jc w:val="both"/>
       </w:pPr>
       <w:r>
-        <w:t xml:space="preserve">2. Un tipo de controlador: el PID</w:t>
+        <w:t xml:space="preserve">2. Controlador PID y operación PI</w:t>
       </w:r>
     </w:p>
     <w:p>
@@ -930,14 +930,14 @@
         <w:t xml:space="preserve">: la acción integral ayuda a corregir diferencias persistentes y omitimos la derivativa porque las burbujas pueden producir ruido en la señal de oxígeno.</w:t>
       </w:r>
     </w:p>
-    <w:bookmarkStart w:id="10" w:name="la-fórmula-paso-a-paso"/>
+    <w:bookmarkStart w:id="10" w:name="ecuación-del-controlador-pid"/>
     <w:p>
       <w:pPr>
         <w:pStyle w:val="Heading2"/>
         <w:jc w:val="both"/>
       </w:pPr>
       <w:r>
-        <w:t xml:space="preserve">La fórmula, paso a paso</w:t>
+        <w:t xml:space="preserve">Ecuación del controlador PID</w:t>
       </w:r>
     </w:p>
     <w:p>
@@ -1117,7 +1117,7 @@
             <m:t>(</m:t>
           </m:r>
           <m:r>
-            <m:t>t</m:t>
+            <m:t>ξ</m:t>
           </m:r>
           <m:r>
             <m:rPr>
@@ -1132,7 +1132,7 @@
             <m:t>d</m:t>
           </m:r>
           <m:r>
-            <m:t>t</m:t>
+            <m:t>ξ</m:t>
           </m:r>
           <m:r>
             <m:rPr>
@@ -1678,15 +1678,270 @@
         <w:t xml:space="preserve">: significan lo mismo.</w:t>
       </w:r>
     </w:p>
+    <w:p>
+      <w:pPr>
+        <w:pStyle w:val="BodyText"/>
+        <w:jc w:val="both"/>
+      </w:pPr>
+      <w:r>
+        <w:t xml:space="preserve">Algunos controladores utilizan los coeficientes</w:t>
+      </w:r>
+      <w:r>
+        <w:t xml:space="preserve"> </w:t>
+      </w:r>
+      <m:oMath>
+        <m:sSub>
+          <m:e>
+            <m:r>
+              <m:t>K</m:t>
+            </m:r>
+          </m:e>
+          <m:sub>
+            <m:r>
+              <m:t>i</m:t>
+            </m:r>
+          </m:sub>
+        </m:sSub>
+        <m:r>
+          <m:rPr>
+            <m:sty m:val="p"/>
+          </m:rPr>
+          <m:t>=</m:t>
+        </m:r>
+        <m:sSub>
+          <m:e>
+            <m:r>
+              <m:t>K</m:t>
+            </m:r>
+          </m:e>
+          <m:sub>
+            <m:r>
+              <m:t>c</m:t>
+            </m:r>
+          </m:sub>
+        </m:sSub>
+        <m:r>
+          <m:rPr>
+            <m:sty m:val="p"/>
+          </m:rPr>
+          <m:t>/</m:t>
+        </m:r>
+        <m:sSub>
+          <m:e>
+            <m:r>
+              <m:t>T</m:t>
+            </m:r>
+          </m:e>
+          <m:sub>
+            <m:r>
+              <m:t>I</m:t>
+            </m:r>
+          </m:sub>
+        </m:sSub>
+      </m:oMath>
+      <w:r>
+        <w:t xml:space="preserve"> </w:t>
+      </w:r>
+      <w:r>
+        <w:t xml:space="preserve">y</w:t>
+      </w:r>
+      <w:r>
+        <w:t xml:space="preserve"> </w:t>
+      </w:r>
+      <m:oMath>
+        <m:sSub>
+          <m:e>
+            <m:r>
+              <m:t>K</m:t>
+            </m:r>
+          </m:e>
+          <m:sub>
+            <m:r>
+              <m:t>d</m:t>
+            </m:r>
+          </m:sub>
+        </m:sSub>
+        <m:r>
+          <m:rPr>
+            <m:sty m:val="p"/>
+          </m:rPr>
+          <m:t>=</m:t>
+        </m:r>
+        <m:sSub>
+          <m:e>
+            <m:r>
+              <m:t>K</m:t>
+            </m:r>
+          </m:e>
+          <m:sub>
+            <m:r>
+              <m:t>c</m:t>
+            </m:r>
+          </m:sub>
+        </m:sSub>
+        <m:sSub>
+          <m:e>
+            <m:r>
+              <m:t>T</m:t>
+            </m:r>
+          </m:e>
+          <m:sub>
+            <m:r>
+              <m:t>D</m:t>
+            </m:r>
+          </m:sub>
+        </m:sSub>
+      </m:oMath>
+      <w:r>
+        <w:t xml:space="preserve"> </w:t>
+      </w:r>
+      <w:r>
+        <w:t xml:space="preserve">de la forma paralela. Estos coeficientes no son los tiempos</w:t>
+      </w:r>
+      <w:r>
+        <w:t xml:space="preserve"> </w:t>
+      </w:r>
+      <m:oMath>
+        <m:sSub>
+          <m:e>
+            <m:r>
+              <m:t>T</m:t>
+            </m:r>
+          </m:e>
+          <m:sub>
+            <m:r>
+              <m:t>I</m:t>
+            </m:r>
+          </m:sub>
+        </m:sSub>
+      </m:oMath>
+      <w:r>
+        <w:t xml:space="preserve"> </w:t>
+      </w:r>
+      <w:r>
+        <w:t xml:space="preserve">y</w:t>
+      </w:r>
+      <w:r>
+        <w:t xml:space="preserve"> </w:t>
+      </w:r>
+      <m:oMath>
+        <m:sSub>
+          <m:e>
+            <m:r>
+              <m:t>T</m:t>
+            </m:r>
+          </m:e>
+          <m:sub>
+            <m:r>
+              <m:t>D</m:t>
+            </m:r>
+          </m:sub>
+        </m:sSub>
+      </m:oMath>
+      <w:r>
+        <w:t xml:space="preserve">. En esta práctica mantendremos</w:t>
+      </w:r>
+      <w:r>
+        <w:t xml:space="preserve"> </w:t>
+      </w:r>
+      <m:oMath>
+        <m:sSub>
+          <m:e>
+            <m:r>
+              <m:t>K</m:t>
+            </m:r>
+          </m:e>
+          <m:sub>
+            <m:r>
+              <m:t>p</m:t>
+            </m:r>
+          </m:sub>
+        </m:sSub>
+      </m:oMath>
+      <w:r>
+        <w:t xml:space="preserve"> </w:t>
+      </w:r>
+      <w:r>
+        <w:t xml:space="preserve">para la ganancia del proceso y</w:t>
+      </w:r>
+      <w:r>
+        <w:t xml:space="preserve"> </w:t>
+      </w:r>
+      <m:oMath>
+        <m:sSub>
+          <m:e>
+            <m:r>
+              <m:t>K</m:t>
+            </m:r>
+          </m:e>
+          <m:sub>
+            <m:r>
+              <m:t>c</m:t>
+            </m:r>
+          </m:sub>
+        </m:sSub>
+      </m:oMath>
+      <w:r>
+        <w:t xml:space="preserve"> </w:t>
+      </w:r>
+      <w:r>
+        <w:t xml:space="preserve">para la del controlador; después convertiremos</w:t>
+      </w:r>
+      <w:r>
+        <w:t xml:space="preserve"> </w:t>
+      </w:r>
+      <m:oMath>
+        <m:sSub>
+          <m:e>
+            <m:r>
+              <m:t>K</m:t>
+            </m:r>
+          </m:e>
+          <m:sub>
+            <m:r>
+              <m:t>c</m:t>
+            </m:r>
+          </m:sub>
+        </m:sSub>
+      </m:oMath>
+      <w:r>
+        <w:t xml:space="preserve"> </w:t>
+      </w:r>
+      <w:r>
+        <w:t xml:space="preserve">a la banda proporcional Xp que solicita Biostat.</w:t>
+      </w:r>
+    </w:p>
+    <w:p>
+      <w:pPr>
+        <w:pStyle w:val="BodyText"/>
+        <w:jc w:val="both"/>
+      </w:pPr>
+      <w:r>
+        <w:t xml:space="preserve">Si la salida alcanza su límite y el error persiste, la acción integral puede seguir acumulándose. Esta acumulación, conocida como</w:t>
+      </w:r>
+      <w:r>
+        <w:t xml:space="preserve"> </w:t>
+      </w:r>
+      <w:r>
+        <w:rPr>
+          <w:i/>
+          <w:iCs/>
+        </w:rPr>
+        <w:t xml:space="preserve">windup</w:t>
+      </w:r>
+      <w:r>
+        <w:t xml:space="preserve">, puede retrasar la recuperación cuando el proceso vuelve a una zona alcanzable. El instructor comprobará qué protección contra acumulación integral ofrece la configuración instalada.</w:t>
+      </w:r>
+    </w:p>
     <w:bookmarkEnd w:id="10"/>
-    <w:bookmarkStart w:id="11" w:name="X96c93faa03bc8b1504d54926059d6092cbb3ece"/>
+    <w:bookmarkStart w:id="11" w:name="ajuste-de-los-parámetros-de-control"/>
     <w:p>
       <w:pPr>
         <w:pStyle w:val="Heading2"/>
         <w:jc w:val="both"/>
       </w:pPr>
       <w:r>
-        <w:t xml:space="preserve">Afinar el controlador: el propósito de esta práctica</w:t>
+        <w:t xml:space="preserve">Ajuste de los parámetros de control</w:t>
       </w:r>
     </w:p>
     <w:p>
@@ -1736,17 +1991,7 @@
         <w:jc w:val="both"/>
       </w:pPr>
       <w:r>
-        <w:rPr>
-          <w:b/>
-          <w:bCs/>
-        </w:rPr>
-        <w:t xml:space="preserve">Eso haremos aquí:</w:t>
-      </w:r>
-      <w:r>
-        <w:t xml:space="preserve"> </w:t>
-      </w:r>
-      <w:r>
-        <w:t xml:space="preserve">cambiar la agitación, observar el oxígeno, calcular un ajuste PI y comprobar cómo responde. Cada equipo usará una regla distinta para comparar los resultados.</w:t>
+        <w:t xml:space="preserve">En esta práctica cambiaremos la agitación, observaremos el oxígeno, calcularemos un ajuste PI y comprobaremos cómo responde. Cada equipo usará una regla distinta para comparar los resultados.</w:t>
       </w:r>
     </w:p>
     <w:bookmarkEnd w:id="11"/>
@@ -2011,7 +2256,7 @@
       </w:tr>
     </w:tbl>
     <w:bookmarkEnd w:id="13"/>
-    <w:bookmarkStart w:id="14" w:name="el-sistema"/>
+    <w:bookmarkStart w:id="15" w:name="el-sistema"/>
     <w:p>
       <w:pPr>
         <w:pStyle w:val="Heading1"/>
@@ -2429,59 +2674,372 @@
         </w:tc>
       </w:tr>
     </w:tbl>
+    <w:bookmarkStart w:id="14" w:name="transferencia-y-consumo-de-oxígeno"/>
+    <w:p>
+      <w:pPr>
+        <w:pStyle w:val="Heading2"/>
+        <w:jc w:val="both"/>
+      </w:pPr>
+      <w:r>
+        <w:t xml:space="preserve">Transferencia y consumo de oxígeno</w:t>
+      </w:r>
+    </w:p>
+    <w:p>
+      <w:pPr>
+        <w:pStyle w:val="FirstParagraph"/>
+        <w:jc w:val="both"/>
+      </w:pPr>
+      <w:r>
+        <w:t xml:space="preserve">El oxígeno que pasa del gas al líquido compite con el que consumen las levaduras. La velocidad volumétrica de transferencia de oxígeno puede expresarse como:</w:t>
+      </w:r>
+    </w:p>
     <w:p>
       <w:pPr>
         <w:pStyle w:val="BodyText"/>
-        <w:spacing w:before="160"/>
+        <w:keepNext w:val="0"/>
+        <w:jc w:val="center"/>
+      </w:pPr>
+      <m:oMathPara>
+        <m:oMathParaPr>
+          <m:jc m:val="center"/>
+        </m:oMathParaPr>
+        <m:oMath>
+          <m:r>
+            <m:rPr>
+              <m:sty m:val="p"/>
+            </m:rPr>
+            <m:t>O</m:t>
+          </m:r>
+          <m:r>
+            <m:rPr>
+              <m:sty m:val="p"/>
+            </m:rPr>
+            <m:t>T</m:t>
+          </m:r>
+          <m:r>
+            <m:rPr>
+              <m:sty m:val="p"/>
+            </m:rPr>
+            <m:t>R</m:t>
+          </m:r>
+          <m:r>
+            <m:rPr>
+              <m:sty m:val="p"/>
+            </m:rPr>
+            <m:t>=</m:t>
+          </m:r>
+          <m:sSub>
+            <m:e>
+              <m:r>
+                <m:t>k</m:t>
+              </m:r>
+            </m:e>
+            <m:sub>
+              <m:r>
+                <m:t>L</m:t>
+              </m:r>
+            </m:sub>
+          </m:sSub>
+          <m:r>
+            <m:t>a</m:t>
+          </m:r>
+          <m:r>
+            <m:t> </m:t>
+          </m:r>
+          <m:r>
+            <m:rPr>
+              <m:sty m:val="p"/>
+            </m:rPr>
+            <m:t>(</m:t>
+          </m:r>
+          <m:sSup>
+            <m:e>
+              <m:r>
+                <m:t>C</m:t>
+              </m:r>
+            </m:e>
+            <m:sup>
+              <m:r>
+                <m:rPr>
+                  <m:sty m:val="p"/>
+                </m:rPr>
+                <m:t>*</m:t>
+              </m:r>
+            </m:sup>
+          </m:sSup>
+          <m:r>
+            <m:rPr>
+              <m:sty m:val="p"/>
+            </m:rPr>
+            <m:t>−</m:t>
+          </m:r>
+          <m:sSub>
+            <m:e>
+              <m:r>
+                <m:t>C</m:t>
+              </m:r>
+            </m:e>
+            <m:sub>
+              <m:r>
+                <m:t>L</m:t>
+              </m:r>
+            </m:sub>
+          </m:sSub>
+          <m:r>
+            <m:rPr>
+              <m:sty m:val="p"/>
+            </m:rPr>
+            <m:t>)</m:t>
+          </m:r>
+        </m:oMath>
+      </m:oMathPara>
+    </w:p>
+    <w:p>
+      <w:pPr>
+        <w:pStyle w:val="FirstParagraph"/>
         <w:jc w:val="both"/>
       </w:pPr>
       <w:r>
-        <w:rPr>
-          <w:b/>
-          <w:bCs/>
-        </w:rPr>
-        <w:t xml:space="preserve">¿Por qué cambia el</w:t>
-      </w:r>
-      <w:r>
-        <w:rPr>
-          <w:b/>
-          <w:bCs/>
-        </w:rPr>
+        <w:t xml:space="preserve">Aquí</w:t>
+      </w:r>
+      <w:r>
         <w:t xml:space="preserve"> </w:t>
       </w:r>
       <m:oMath>
-        <m:r>
-          <m:t>p</m:t>
-        </m:r>
         <m:sSub>
           <m:e>
             <m:r>
-              <m:t>O</m:t>
+              <m:t>k</m:t>
             </m:r>
           </m:e>
           <m:sub>
             <m:r>
-              <m:t>2</m:t>
+              <m:t>L</m:t>
+            </m:r>
+          </m:sub>
+        </m:sSub>
+        <m:r>
+          <m:t>a</m:t>
+        </m:r>
+      </m:oMath>
+      <w:r>
+        <w:t xml:space="preserve"> </w:t>
+      </w:r>
+      <w:r>
+        <w:t xml:space="preserve">es el coeficiente volumétrico de transferencia,</w:t>
+      </w:r>
+      <w:r>
+        <w:t xml:space="preserve"> </w:t>
+      </w:r>
+      <m:oMath>
+        <m:sSup>
+          <m:e>
+            <m:r>
+              <m:t>C</m:t>
+            </m:r>
+          </m:e>
+          <m:sup>
+            <m:r>
+              <m:rPr>
+                <m:sty m:val="p"/>
+              </m:rPr>
+              <m:t>*</m:t>
+            </m:r>
+          </m:sup>
+        </m:sSup>
+      </m:oMath>
+      <w:r>
+        <w:t xml:space="preserve"> </w:t>
+      </w:r>
+      <w:r>
+        <w:t xml:space="preserve">la concentración de oxígeno en equilibrio con el gas y</w:t>
+      </w:r>
+      <w:r>
+        <w:t xml:space="preserve"> </w:t>
+      </w:r>
+      <m:oMath>
+        <m:sSub>
+          <m:e>
+            <m:r>
+              <m:t>C</m:t>
+            </m:r>
+          </m:e>
+          <m:sub>
+            <m:r>
+              <m:t>L</m:t>
             </m:r>
           </m:sub>
         </m:sSub>
       </m:oMath>
       <w:r>
-        <w:rPr>
-          <w:b/>
-          <w:bCs/>
-        </w:rPr>
-        <w:t xml:space="preserve">?</w:t>
-      </w:r>
-      <w:r>
-        <w:t xml:space="preserve"> </w:t>
-      </w:r>
-      <w:r>
-        <w:t xml:space="preserve">El oxígeno que pasa del aire al líquido compite con el que consumen las levaduras. Al aumentar la agitación se favorece esa transferencia y el oxígeno disuelto puede subir hasta un nuevo equilibrio. Durante los pocos minutos de la medición suponemos que el consumo cambia poco. No necesitamos calcular ese consumo para realizar la práctica.</w:t>
+        <w:t xml:space="preserve"> </w:t>
+      </w:r>
+      <w:r>
+        <w:t xml:space="preserve">la concentración en el líquido. OTR es la sigla de la velocidad de transferencia de oxígeno. Si el volumen permanece constante y se considera un líquido bien mezclado, el balance simplificado es:</w:t>
+      </w:r>
+    </w:p>
+    <w:p>
+      <w:pPr>
+        <w:pStyle w:val="BodyText"/>
+        <w:keepNext w:val="0"/>
+        <w:jc w:val="center"/>
+      </w:pPr>
+      <m:oMathPara>
+        <m:oMathParaPr>
+          <m:jc m:val="center"/>
+        </m:oMathParaPr>
+        <m:oMath>
+          <m:f>
+            <m:fPr>
+              <m:type m:val="bar"/>
+            </m:fPr>
+            <m:num>
+              <m:r>
+                <m:t>d</m:t>
+              </m:r>
+              <m:sSub>
+                <m:e>
+                  <m:r>
+                    <m:t>C</m:t>
+                  </m:r>
+                </m:e>
+                <m:sub>
+                  <m:r>
+                    <m:t>L</m:t>
+                  </m:r>
+                </m:sub>
+              </m:sSub>
+            </m:num>
+            <m:den>
+              <m:r>
+                <m:t>d</m:t>
+              </m:r>
+              <m:r>
+                <m:t>t</m:t>
+              </m:r>
+            </m:den>
+          </m:f>
+          <m:r>
+            <m:rPr>
+              <m:sty m:val="p"/>
+            </m:rPr>
+            <m:t>=</m:t>
+          </m:r>
+          <m:r>
+            <m:rPr>
+              <m:sty m:val="p"/>
+            </m:rPr>
+            <m:t>O</m:t>
+          </m:r>
+          <m:r>
+            <m:rPr>
+              <m:sty m:val="p"/>
+            </m:rPr>
+            <m:t>T</m:t>
+          </m:r>
+          <m:r>
+            <m:rPr>
+              <m:sty m:val="p"/>
+            </m:rPr>
+            <m:t>R</m:t>
+          </m:r>
+          <m:r>
+            <m:rPr>
+              <m:sty m:val="p"/>
+            </m:rPr>
+            <m:t>−</m:t>
+          </m:r>
+          <m:r>
+            <m:rPr>
+              <m:sty m:val="p"/>
+            </m:rPr>
+            <m:t>O</m:t>
+          </m:r>
+          <m:r>
+            <m:rPr>
+              <m:sty m:val="p"/>
+            </m:rPr>
+            <m:t>U</m:t>
+          </m:r>
+          <m:r>
+            <m:rPr>
+              <m:sty m:val="p"/>
+            </m:rPr>
+            <m:t>R</m:t>
+          </m:r>
+        </m:oMath>
+      </m:oMathPara>
+    </w:p>
+    <w:p>
+      <w:pPr>
+        <w:pStyle w:val="FirstParagraph"/>
+        <w:jc w:val="both"/>
+      </w:pPr>
+      <w:r>
+        <w:t xml:space="preserve">OUR es la velocidad volumétrica de consumo de oxígeno por las células. Cuando transferencia y consumo se igualan, la concentración se mantiene estable. Al aumentar la agitación se favorece la transferencia y el oxígeno disuelto puede subir hasta un nuevo equilibrio. Durante los pocos minutos de la medición suponemos que el consumo cambia poco. No necesitamos calcular</w:t>
+      </w:r>
+      <w:r>
+        <w:t xml:space="preserve"> </w:t>
+      </w:r>
+      <m:oMath>
+        <m:sSub>
+          <m:e>
+            <m:r>
+              <m:t>k</m:t>
+            </m:r>
+          </m:e>
+          <m:sub>
+            <m:r>
+              <m:t>L</m:t>
+            </m:r>
+          </m:sub>
+        </m:sSub>
+        <m:r>
+          <m:t>a</m:t>
+        </m:r>
+      </m:oMath>
+      <w:r>
+        <w:t xml:space="preserve"> </w:t>
+      </w:r>
+      <w:r>
+        <w:t xml:space="preserve">ni OUR para realizar la práctica.</w:t>
+      </w:r>
+    </w:p>
+    <w:p>
+      <w:pPr>
+        <w:pStyle w:val="BodyText"/>
+        <w:jc w:val="both"/>
+      </w:pPr>
+      <w:r>
+        <w:t xml:space="preserve">En otros montajes también se puede actuar sobre el caudal de gas o su fracción de oxígeno. El caudal puede modificar la transferencia y la formación de espuma; el enriquecimiento cambia la concentración de equilibrio</w:t>
+      </w:r>
+      <w:r>
+        <w:t xml:space="preserve"> </w:t>
+      </w:r>
+      <m:oMath>
+        <m:sSup>
+          <m:e>
+            <m:r>
+              <m:t>C</m:t>
+            </m:r>
+          </m:e>
+          <m:sup>
+            <m:r>
+              <m:rPr>
+                <m:sty m:val="p"/>
+              </m:rPr>
+              <m:t>*</m:t>
+            </m:r>
+          </m:sup>
+        </m:sSup>
+      </m:oMath>
+      <w:r>
+        <w:t xml:space="preserve">. En este taller se modifica únicamente la agitación y se mantiene el aire fijo.</w:t>
       </w:r>
     </w:p>
     <w:bookmarkEnd w:id="14"/>
-    <w:bookmarkStart w:id="18" w:name="la-curva-de-reacción-del-proceso"/>
+    <w:bookmarkEnd w:id="15"/>
+    <w:bookmarkStart w:id="19" w:name="la-curva-de-reacción-del-proceso"/>
     <w:p>
       <w:pPr>
         <w:pStyle w:val="Heading1"/>
@@ -2509,19 +3067,7 @@
         <w:t xml:space="preserve">MAN</w:t>
       </w:r>
       <w:r>
-        <w:t xml:space="preserve">). Es la</w:t>
-      </w:r>
-      <w:r>
-        <w:t xml:space="preserve"> </w:t>
-      </w:r>
-      <w:r>
-        <w:t xml:space="preserve">“huella dinámica”</w:t>
-      </w:r>
-      <w:r>
-        <w:t xml:space="preserve"> </w:t>
-      </w:r>
-      <w:r>
-        <w:t xml:space="preserve">del proceso: muestra cuánto cambia la salida, cuánto tarda en empezar a cambiar y qué tan rápido llega a su nuevo valor. Ziegler y Nichols (1942) propusieron sintonizar controladores a partir de esta sola prueba, sin necesidad de un modelo teórico; por eso estos métodos se llaman</w:t>
+        <w:t xml:space="preserve">). Muestra cuánto cambia la salida, cuánto tarda en empezar a cambiar y qué tan rápido llega a su nuevo valor. Ziegler y Nichols (1942) propusieron sintonizar controladores a partir de esta sola prueba, sin necesidad de un modelo teórico; por eso estos métodos se llaman</w:t>
       </w:r>
       <w:r>
         <w:t xml:space="preserve"> </w:t>
@@ -2625,18 +3171,18 @@
           <wp:inline>
             <wp:extent cx="5040000" cy="1791999"/>
             <wp:effectExtent b="0" l="0" r="0" t="0"/>
-            <wp:docPr descr="Escalón de agitación: de 200 a 500 rpm en el instante cero" title="" id="16" name="Picture"/>
+            <wp:docPr descr="Escalón de agitación: de 200 a 500 rpm en el instante cero" title="" id="17" name="Picture"/>
             <a:graphic>
               <a:graphicData uri="http://schemas.openxmlformats.org/drawingml/2006/picture">
                 <pic:pic>
                   <pic:nvPicPr>
-                    <pic:cNvPr descr="../figuras/04_escalon_agitacion.png" id="17" name="Picture"/>
+                    <pic:cNvPr descr="../figuras/04_escalon_agitacion.png" id="18" name="Picture"/>
                     <pic:cNvPicPr>
                       <a:picLocks noChangeArrowheads="1" noChangeAspect="1"/>
                     </pic:cNvPicPr>
                   </pic:nvPicPr>
                   <pic:blipFill>
-                    <a:blip r:embed="rId15"/>
+                    <a:blip r:embed="rId16"/>
                     <a:stretch>
                       <a:fillRect/>
                     </a:stretch>
@@ -2952,6 +3498,498 @@
         <w:jc w:val="both"/>
       </w:pPr>
       <w:r>
+        <w:t xml:space="preserve">Para un escalón aplicado en</w:t>
+      </w:r>
+      <w:r>
+        <w:t xml:space="preserve"> </w:t>
+      </w:r>
+      <m:oMath>
+        <m:sSub>
+          <m:e>
+            <m:r>
+              <m:t>t</m:t>
+            </m:r>
+          </m:e>
+          <m:sub>
+            <m:r>
+              <m:t>0</m:t>
+            </m:r>
+          </m:sub>
+        </m:sSub>
+      </m:oMath>
+      <w:r>
+        <w:t xml:space="preserve">, la respuesta del modelo después del tiempo muerto es:</w:t>
+      </w:r>
+    </w:p>
+    <w:p>
+      <w:pPr>
+        <w:pStyle w:val="BodyText"/>
+        <w:keepNext w:val="0"/>
+        <w:jc w:val="center"/>
+      </w:pPr>
+      <m:oMathPara>
+        <m:oMathParaPr>
+          <m:jc m:val="center"/>
+        </m:oMathParaPr>
+        <m:oMath>
+          <m:r>
+            <m:t>y</m:t>
+          </m:r>
+          <m:r>
+            <m:rPr>
+              <m:sty m:val="p"/>
+            </m:rPr>
+            <m:t>(</m:t>
+          </m:r>
+          <m:r>
+            <m:t>t</m:t>
+          </m:r>
+          <m:r>
+            <m:rPr>
+              <m:sty m:val="p"/>
+            </m:rPr>
+            <m:t>)</m:t>
+          </m:r>
+          <m:r>
+            <m:rPr>
+              <m:sty m:val="p"/>
+            </m:rPr>
+            <m:t>=</m:t>
+          </m:r>
+          <m:sSub>
+            <m:e>
+              <m:r>
+                <m:t>y</m:t>
+              </m:r>
+            </m:e>
+            <m:sub>
+              <m:r>
+                <m:t>0</m:t>
+              </m:r>
+            </m:sub>
+          </m:sSub>
+          <m:r>
+            <m:rPr>
+              <m:sty m:val="p"/>
+            </m:rPr>
+            <m:t>+</m:t>
+          </m:r>
+          <m:r>
+            <m:rPr>
+              <m:sty m:val="p"/>
+            </m:rPr>
+            <m:t>Δ</m:t>
+          </m:r>
+          <m:r>
+            <m:t>y</m:t>
+          </m:r>
+          <m:d>
+            <m:dPr>
+              <m:begChr m:val="["/>
+              <m:sepChr m:val=""/>
+              <m:endChr m:val="]"/>
+              <m:grow/>
+            </m:dPr>
+            <m:e>
+              <m:r>
+                <m:t>1</m:t>
+              </m:r>
+              <m:r>
+                <m:rPr>
+                  <m:sty m:val="p"/>
+                </m:rPr>
+                <m:t>−</m:t>
+              </m:r>
+              <m:sSup>
+                <m:e>
+                  <m:r>
+                    <m:t>e</m:t>
+                  </m:r>
+                </m:e>
+                <m:sup>
+                  <m:r>
+                    <m:rPr>
+                      <m:sty m:val="p"/>
+                    </m:rPr>
+                    <m:t>−</m:t>
+                  </m:r>
+                  <m:r>
+                    <m:rPr>
+                      <m:sty m:val="p"/>
+                    </m:rPr>
+                    <m:t>(</m:t>
+                  </m:r>
+                  <m:r>
+                    <m:t>t</m:t>
+                  </m:r>
+                  <m:r>
+                    <m:rPr>
+                      <m:sty m:val="p"/>
+                    </m:rPr>
+                    <m:t>−</m:t>
+                  </m:r>
+                  <m:sSub>
+                    <m:e>
+                      <m:r>
+                        <m:t>t</m:t>
+                      </m:r>
+                    </m:e>
+                    <m:sub>
+                      <m:r>
+                        <m:t>0</m:t>
+                      </m:r>
+                    </m:sub>
+                  </m:sSub>
+                  <m:r>
+                    <m:rPr>
+                      <m:sty m:val="p"/>
+                    </m:rPr>
+                    <m:t>−</m:t>
+                  </m:r>
+                  <m:r>
+                    <m:t>θ</m:t>
+                  </m:r>
+                  <m:r>
+                    <m:rPr>
+                      <m:sty m:val="p"/>
+                    </m:rPr>
+                    <m:t>)</m:t>
+                  </m:r>
+                  <m:r>
+                    <m:rPr>
+                      <m:sty m:val="p"/>
+                    </m:rPr>
+                    <m:t>/</m:t>
+                  </m:r>
+                  <m:r>
+                    <m:t>τ</m:t>
+                  </m:r>
+                </m:sup>
+              </m:sSup>
+            </m:e>
+          </m:d>
+          <m:r>
+            <m:rPr>
+              <m:sty m:val="p"/>
+            </m:rPr>
+            <m:t>,</m:t>
+          </m:r>
+          <m:r>
+            <m:t>  </m:t>
+          </m:r>
+          <m:r>
+            <m:t>t</m:t>
+          </m:r>
+          <m:r>
+            <m:rPr>
+              <m:sty m:val="p"/>
+            </m:rPr>
+            <m:t>≥</m:t>
+          </m:r>
+          <m:sSub>
+            <m:e>
+              <m:r>
+                <m:t>t</m:t>
+              </m:r>
+            </m:e>
+            <m:sub>
+              <m:r>
+                <m:t>0</m:t>
+              </m:r>
+            </m:sub>
+          </m:sSub>
+          <m:r>
+            <m:rPr>
+              <m:sty m:val="p"/>
+            </m:rPr>
+            <m:t>+</m:t>
+          </m:r>
+          <m:r>
+            <m:t>θ</m:t>
+          </m:r>
+        </m:oMath>
+      </m:oMathPara>
+    </w:p>
+    <w:p>
+      <w:pPr>
+        <w:pStyle w:val="FirstParagraph"/>
+        <w:jc w:val="both"/>
+      </w:pPr>
+      <w:r>
+        <w:t xml:space="preserve">Antes de</w:t>
+      </w:r>
+      <w:r>
+        <w:t xml:space="preserve"> </w:t>
+      </w:r>
+      <m:oMath>
+        <m:sSub>
+          <m:e>
+            <m:r>
+              <m:t>t</m:t>
+            </m:r>
+          </m:e>
+          <m:sub>
+            <m:r>
+              <m:t>0</m:t>
+            </m:r>
+          </m:sub>
+        </m:sSub>
+        <m:r>
+          <m:rPr>
+            <m:sty m:val="p"/>
+          </m:rPr>
+          <m:t>+</m:t>
+        </m:r>
+        <m:r>
+          <m:t>θ</m:t>
+        </m:r>
+      </m:oMath>
+      <w:r>
+        <w:t xml:space="preserve">, el modelo conserva</w:t>
+      </w:r>
+      <w:r>
+        <w:t xml:space="preserve"> </w:t>
+      </w:r>
+      <m:oMath>
+        <m:r>
+          <m:t>y</m:t>
+        </m:r>
+        <m:r>
+          <m:rPr>
+            <m:sty m:val="p"/>
+          </m:rPr>
+          <m:t>=</m:t>
+        </m:r>
+        <m:sSub>
+          <m:e>
+            <m:r>
+              <m:t>y</m:t>
+            </m:r>
+          </m:e>
+          <m:sub>
+            <m:r>
+              <m:t>0</m:t>
+            </m:r>
+          </m:sub>
+        </m:sSub>
+      </m:oMath>
+      <w:r>
+        <w:t xml:space="preserve">. Al transcurrir una constante de tiempo después del tiempo muerto,</w:t>
+      </w:r>
+      <w:r>
+        <w:t xml:space="preserve"> </w:t>
+      </w:r>
+      <m:oMath>
+        <m:r>
+          <m:t>t</m:t>
+        </m:r>
+        <m:r>
+          <m:rPr>
+            <m:sty m:val="p"/>
+          </m:rPr>
+          <m:t>−</m:t>
+        </m:r>
+        <m:sSub>
+          <m:e>
+            <m:r>
+              <m:t>t</m:t>
+            </m:r>
+          </m:e>
+          <m:sub>
+            <m:r>
+              <m:t>0</m:t>
+            </m:r>
+          </m:sub>
+        </m:sSub>
+        <m:r>
+          <m:rPr>
+            <m:sty m:val="p"/>
+          </m:rPr>
+          <m:t>−</m:t>
+        </m:r>
+        <m:r>
+          <m:t>θ</m:t>
+        </m:r>
+        <m:r>
+          <m:rPr>
+            <m:sty m:val="p"/>
+          </m:rPr>
+          <m:t>=</m:t>
+        </m:r>
+        <m:r>
+          <m:t>τ</m:t>
+        </m:r>
+      </m:oMath>
+      <w:r>
+        <w:t xml:space="preserve">, la fracción recorrida es:</w:t>
+      </w:r>
+    </w:p>
+    <w:p>
+      <w:pPr>
+        <w:pStyle w:val="BodyText"/>
+        <w:keepNext w:val="0"/>
+        <w:jc w:val="center"/>
+      </w:pPr>
+      <m:oMathPara>
+        <m:oMathParaPr>
+          <m:jc m:val="center"/>
+        </m:oMathParaPr>
+        <m:oMath>
+          <m:f>
+            <m:fPr>
+              <m:type m:val="bar"/>
+            </m:fPr>
+            <m:num>
+              <m:r>
+                <m:t>y</m:t>
+              </m:r>
+              <m:r>
+                <m:rPr>
+                  <m:sty m:val="p"/>
+                </m:rPr>
+                <m:t>−</m:t>
+              </m:r>
+              <m:sSub>
+                <m:e>
+                  <m:r>
+                    <m:t>y</m:t>
+                  </m:r>
+                </m:e>
+                <m:sub>
+                  <m:r>
+                    <m:t>0</m:t>
+                  </m:r>
+                </m:sub>
+              </m:sSub>
+            </m:num>
+            <m:den>
+              <m:r>
+                <m:rPr>
+                  <m:sty m:val="p"/>
+                </m:rPr>
+                <m:t>Δ</m:t>
+              </m:r>
+              <m:r>
+                <m:t>y</m:t>
+              </m:r>
+            </m:den>
+          </m:f>
+          <m:r>
+            <m:rPr>
+              <m:sty m:val="p"/>
+            </m:rPr>
+            <m:t>=</m:t>
+          </m:r>
+          <m:r>
+            <m:t>1</m:t>
+          </m:r>
+          <m:r>
+            <m:rPr>
+              <m:sty m:val="p"/>
+            </m:rPr>
+            <m:t>−</m:t>
+          </m:r>
+          <m:sSup>
+            <m:e>
+              <m:r>
+                <m:t>e</m:t>
+              </m:r>
+            </m:e>
+            <m:sup>
+              <m:r>
+                <m:rPr>
+                  <m:sty m:val="p"/>
+                </m:rPr>
+                <m:t>−</m:t>
+              </m:r>
+              <m:r>
+                <m:t>1</m:t>
+              </m:r>
+            </m:sup>
+          </m:sSup>
+          <m:r>
+            <m:rPr>
+              <m:sty m:val="p"/>
+            </m:rPr>
+            <m:t>≈</m:t>
+          </m:r>
+          <m:r>
+            <m:t>0.632</m:t>
+          </m:r>
+          <m:r>
+            <m:rPr>
+              <m:sty m:val="p"/>
+            </m:rPr>
+            <m:t>=</m:t>
+          </m:r>
+          <m:r>
+            <m:t>63.2</m:t>
+          </m:r>
+          <m:r>
+            <m:t> </m:t>
+          </m:r>
+          <m:r>
+            <m:rPr>
+              <m:sty m:val="p"/>
+            </m:rPr>
+            <m:t>%</m:t>
+          </m:r>
+        </m:oMath>
+      </m:oMathPara>
+    </w:p>
+    <w:p>
+      <w:pPr>
+        <w:pStyle w:val="FirstParagraph"/>
+        <w:jc w:val="both"/>
+      </w:pPr>
+      <w:r>
+        <w:t xml:space="preserve">Por eso el tiempo al 63.2 %, contado desde el escalón, es</w:t>
+      </w:r>
+      <w:r>
+        <w:t xml:space="preserve"> </w:t>
+      </w:r>
+      <m:oMath>
+        <m:sSub>
+          <m:e>
+            <m:r>
+              <m:t>t</m:t>
+            </m:r>
+          </m:e>
+          <m:sub>
+            <m:r>
+              <m:t>63</m:t>
+            </m:r>
+          </m:sub>
+        </m:sSub>
+        <m:r>
+          <m:rPr>
+            <m:sty m:val="p"/>
+          </m:rPr>
+          <m:t>=</m:t>
+        </m:r>
+        <m:r>
+          <m:t>θ</m:t>
+        </m:r>
+        <m:r>
+          <m:rPr>
+            <m:sty m:val="p"/>
+          </m:rPr>
+          <m:t>+</m:t>
+        </m:r>
+        <m:r>
+          <m:t>τ</m:t>
+        </m:r>
+      </m:oMath>
+      <w:r>
+        <w:t xml:space="preserve">. Se trata de un modelo de primer orden porque describe la dinámica mediante una primera derivada. En este caso, τ caracteriza la respuesta del proceso medido, incluyendo transferencia, mezcla y medición; no es la constante de tiempo de la sonda aislada.</w:t>
+      </w:r>
+    </w:p>
+    <w:p>
+      <w:pPr>
+        <w:pStyle w:val="BodyText"/>
+        <w:jc w:val="both"/>
+      </w:pPr>
+      <w:r>
         <w:t xml:space="preserve">Todos los equipos leen igual</w:t>
       </w:r>
       <w:r>
@@ -3085,15 +4123,15 @@
         <w:t xml:space="preserve">(sección 7).</w:t>
       </w:r>
     </w:p>
-    <w:bookmarkEnd w:id="18"/>
-    <w:bookmarkStart w:id="19" w:name="antes-de-calcular-unidades-y-símbolos"/>
+    <w:bookmarkEnd w:id="19"/>
+    <w:bookmarkStart w:id="20" w:name="unidades-y-normalización-de-la-salida"/>
     <w:p>
       <w:pPr>
         <w:pStyle w:val="Heading1"/>
         <w:jc w:val="both"/>
       </w:pPr>
       <w:r>
-        <w:t xml:space="preserve">6. Antes de calcular: unidades y símbolos</w:t>
+        <w:t xml:space="preserve">6. Unidades y normalización de la salida</w:t>
       </w:r>
     </w:p>
     <w:p>
@@ -3688,15 +4726,15 @@
         <w:t xml:space="preserve">de la pantalla, como explica la nota final.</w:t>
       </w:r>
     </w:p>
-    <w:bookmarkEnd w:id="19"/>
-    <w:bookmarkStart w:id="26" w:name="cada-método-lee-la-curva-a-su-manera"/>
+    <w:bookmarkEnd w:id="20"/>
+    <w:bookmarkStart w:id="27" w:name="X731ff06b0b0e4c1c37d3694b1e10646f5a31ad7"/>
     <w:p>
       <w:pPr>
         <w:pStyle w:val="Heading1"/>
         <w:jc w:val="both"/>
       </w:pPr>
       <w:r>
-        <w:t xml:space="preserve">7. Cada método lee la curva a su manera</w:t>
+        <w:t xml:space="preserve">7. Estimación del modelo y reglas de ajuste PI</w:t>
       </w:r>
     </w:p>
     <w:p>
@@ -3744,18 +4782,18 @@
           <wp:inline>
             <wp:extent cx="4500000" cy="6120000"/>
             <wp:effectExtent b="0" l="0" r="0" t="0"/>
-            <wp:docPr descr="Cómo lee la curva cada método" title="" id="21" name="Picture"/>
+            <wp:docPr descr="Cómo lee la curva cada método" title="" id="22" name="Picture"/>
             <a:graphic>
               <a:graphicData uri="http://schemas.openxmlformats.org/drawingml/2006/picture">
                 <pic:pic>
                   <pic:nvPicPr>
-                    <pic:cNvPr descr="../figuras/12_B1.20261014.2_escalon2_criterios_vertical.png" id="22" name="Picture"/>
+                    <pic:cNvPr descr="../figuras/12_B1.20261014.2_escalon2_criterios_vertical.png" id="23" name="Picture"/>
                     <pic:cNvPicPr>
                       <a:picLocks noChangeArrowheads="1" noChangeAspect="1"/>
                     </pic:cNvPicPr>
                   </pic:nvPicPr>
                   <pic:blipFill>
-                    <a:blip r:embed="rId20"/>
+                    <a:blip r:embed="rId21"/>
                     <a:stretch>
                       <a:fillRect/>
                     </a:stretch>
@@ -3792,7 +4830,7 @@
         <w:t xml:space="preserve">Cómo lee la curva cada método</w:t>
       </w:r>
     </w:p>
-    <w:bookmarkStart w:id="23" w:name="equipo-1-ziegler-nichols-recta-tangente"/>
+    <w:bookmarkStart w:id="24" w:name="equipo-1-ziegler-nichols-recta-tangente"/>
     <w:p>
       <w:pPr>
         <w:pStyle w:val="Heading2"/>
@@ -4171,8 +5209,8 @@
         </m:oMath>
       </m:oMathPara>
     </w:p>
-    <w:bookmarkEnd w:id="23"/>
-    <w:bookmarkStart w:id="24" w:name="X91add04d606666c6063d2363883c84b48842c8f"/>
+    <w:bookmarkEnd w:id="24"/>
+    <w:bookmarkStart w:id="25" w:name="X91add04d606666c6063d2363883c84b48842c8f"/>
     <w:p>
       <w:pPr>
         <w:pStyle w:val="Heading2"/>
@@ -4906,8 +5944,8 @@
         <w:t xml:space="preserve">.)</w:t>
       </w:r>
     </w:p>
-    <w:bookmarkEnd w:id="24"/>
-    <w:bookmarkStart w:id="25" w:name="equipo-3-itae-dos-puntos-smith"/>
+    <w:bookmarkEnd w:id="25"/>
+    <w:bookmarkStart w:id="26" w:name="equipo-3-itae-dos-puntos-smith"/>
     <w:p>
       <w:pPr>
         <w:pStyle w:val="Heading2"/>
@@ -5634,16 +6672,401 @@
         <w:t xml:space="preserve">. TD se deja en cero porque las burbujas meten ruido en la señal de pO₂ y la acción derivativa lo amplificaría.</w:t>
       </w:r>
     </w:p>
-    <w:bookmarkEnd w:id="25"/>
     <w:bookmarkEnd w:id="26"/>
-    <w:bookmarkStart w:id="27" w:name="seis-personas-seis-roles"/>
+    <w:bookmarkEnd w:id="27"/>
+    <w:bookmarkStart w:id="29" w:name="conversión-de-parámetros-a-xp-ti-y-td"/>
     <w:p>
       <w:pPr>
         <w:pStyle w:val="Heading1"/>
         <w:jc w:val="both"/>
       </w:pPr>
       <w:r>
-        <w:t xml:space="preserve">8. Seis personas, seis roles</w:t>
+        <w:t xml:space="preserve">Conversión de parámetros a Xp, TI y TD</w:t>
+      </w:r>
+    </w:p>
+    <w:p>
+      <w:pPr>
+        <w:pStyle w:val="FirstParagraph"/>
+        <w:jc w:val="both"/>
+      </w:pPr>
+      <w:r>
+        <w:t xml:space="preserve">En la configuración de esta práctica, la DCU pide</w:t>
+      </w:r>
+      <w:r>
+        <w:t xml:space="preserve"> </w:t>
+      </w:r>
+      <w:r>
+        <w:rPr>
+          <w:b/>
+          <w:bCs/>
+        </w:rPr>
+        <w:t xml:space="preserve">Xp, TI y TD</w:t>
+      </w:r>
+      <w:r>
+        <w:t xml:space="preserve">. TI es el tiempo integral en segundos y TD el derivativo (aquí, 0 s).</w:t>
+      </w:r>
+      <w:r>
+        <w:t xml:space="preserve"> </w:t>
+      </w:r>
+      <w:r>
+        <w:rPr>
+          <w:b/>
+          <w:bCs/>
+        </w:rPr>
+        <w:t xml:space="preserve">Xp es la banda proporcional</w:t>
+      </w:r>
+      <w:r>
+        <w:t xml:space="preserve">, por lo que no debemos escribir directamente la ganancia</w:t>
+      </w:r>
+      <w:r>
+        <w:t xml:space="preserve"> </w:t>
+      </w:r>
+      <m:oMath>
+        <m:sSub>
+          <m:e>
+            <m:r>
+              <m:t>K</m:t>
+            </m:r>
+          </m:e>
+          <m:sub>
+            <m:r>
+              <m:t>c</m:t>
+            </m:r>
+          </m:sub>
+        </m:sSub>
+      </m:oMath>
+      <w:r>
+        <w:t xml:space="preserve"> </w:t>
+      </w:r>
+      <w:r>
+        <w:t xml:space="preserve">en ese campo.</w:t>
+      </w:r>
+    </w:p>
+    <w:p>
+      <w:pPr>
+        <w:pStyle w:val="BodyText"/>
+        <w:jc w:val="both"/>
+      </w:pPr>
+      <w:r>
+        <w:t xml:space="preserve">Las reglas de la sección 7 usan una salida normalizada de 0 a 100 %. Con el oxígeno expresado sobre una escala de 0 a 100 % de saturación:</w:t>
+      </w:r>
+    </w:p>
+    <w:p>
+      <w:pPr>
+        <w:pStyle w:val="BodyText"/>
+        <w:keepNext w:val="0"/>
+        <w:jc w:val="center"/>
+      </w:pPr>
+      <m:oMathPara>
+        <m:oMathParaPr>
+          <m:jc m:val="center"/>
+        </m:oMathParaPr>
+        <m:oMath>
+          <m:sSub>
+            <m:e>
+              <m:r>
+                <m:t>X</m:t>
+              </m:r>
+            </m:e>
+            <m:sub>
+              <m:r>
+                <m:t>p</m:t>
+              </m:r>
+            </m:sub>
+          </m:sSub>
+          <m:r>
+            <m:rPr>
+              <m:sty m:val="p"/>
+            </m:rPr>
+            <m:t>=</m:t>
+          </m:r>
+          <m:f>
+            <m:fPr>
+              <m:type m:val="bar"/>
+            </m:fPr>
+            <m:num>
+              <m:r>
+                <m:t>100</m:t>
+              </m:r>
+            </m:num>
+            <m:den>
+              <m:sSub>
+                <m:e>
+                  <m:r>
+                    <m:t>K</m:t>
+                  </m:r>
+                </m:e>
+                <m:sub>
+                  <m:r>
+                    <m:t>c</m:t>
+                  </m:r>
+                  <m:r>
+                    <m:rPr>
+                      <m:sty m:val="p"/>
+                    </m:rPr>
+                    <m:t>,</m:t>
+                  </m:r>
+                  <m:r>
+                    <m:rPr>
+                      <m:nor/>
+                      <m:sty m:val="p"/>
+                    </m:rPr>
+                    <m:t>norm</m:t>
+                  </m:r>
+                </m:sub>
+              </m:sSub>
+            </m:den>
+          </m:f>
+        </m:oMath>
+      </m:oMathPara>
+    </w:p>
+    <w:p>
+      <w:pPr>
+        <w:pStyle w:val="FirstParagraph"/>
+        <w:jc w:val="both"/>
+      </w:pPr>
+      <w:r>
+        <w:t xml:space="preserve">Por ejemplo, si calculamos</w:t>
+      </w:r>
+      <w:r>
+        <w:t xml:space="preserve"> </w:t>
+      </w:r>
+      <m:oMath>
+        <m:sSub>
+          <m:e>
+            <m:r>
+              <m:t>K</m:t>
+            </m:r>
+          </m:e>
+          <m:sub>
+            <m:r>
+              <m:t>c</m:t>
+            </m:r>
+            <m:r>
+              <m:rPr>
+                <m:sty m:val="p"/>
+              </m:rPr>
+              <m:t>,</m:t>
+            </m:r>
+            <m:r>
+              <m:rPr>
+                <m:nor/>
+                <m:sty m:val="p"/>
+              </m:rPr>
+              <m:t>norm</m:t>
+            </m:r>
+          </m:sub>
+        </m:sSub>
+        <m:r>
+          <m:rPr>
+            <m:sty m:val="p"/>
+          </m:rPr>
+          <m:t>=</m:t>
+        </m:r>
+        <m:r>
+          <m:t>2.5</m:t>
+        </m:r>
+      </m:oMath>
+      <w:r>
+        <w:t xml:space="preserve"> </w:t>
+      </w:r>
+      <w:r>
+        <w:t xml:space="preserve">y</w:t>
+      </w:r>
+      <w:r>
+        <w:t xml:space="preserve"> </w:t>
+      </w:r>
+      <m:oMath>
+        <m:sSub>
+          <m:e>
+            <m:r>
+              <m:t>T</m:t>
+            </m:r>
+          </m:e>
+          <m:sub>
+            <m:r>
+              <m:t>I</m:t>
+            </m:r>
+          </m:sub>
+        </m:sSub>
+        <m:r>
+          <m:rPr>
+            <m:sty m:val="p"/>
+          </m:rPr>
+          <m:t>=</m:t>
+        </m:r>
+        <m:r>
+          <m:t>70</m:t>
+        </m:r>
+      </m:oMath>
+      <w:r>
+        <w:t xml:space="preserve"> </w:t>
+      </w:r>
+      <w:r>
+        <w:t xml:space="preserve">s, introducimos</w:t>
+      </w:r>
+      <w:r>
+        <w:t xml:space="preserve"> </w:t>
+      </w:r>
+      <w:r>
+        <w:rPr>
+          <w:b/>
+          <w:bCs/>
+        </w:rPr>
+        <w:t xml:space="preserve">Xp = 40 %, TI = 70 s y TD = 0 s</w:t>
+      </w:r>
+      <w:r>
+        <w:t xml:space="preserve">. Una banda Xp menor produce una corrección proporcional mayor. En ese ejemplo, un error de 4 puntos de oxígeno aporta una corrección P de 10 puntos de salida, equivalentes a 100 rpm con Span = 1000 rpm; la acción integral se suma a esa corrección.</w:t>
+      </w:r>
+    </w:p>
+    <w:p>
+      <w:pPr>
+        <w:pStyle w:val="BodyText"/>
+        <w:jc w:val="both"/>
+      </w:pPr>
+      <w:r>
+        <w:t xml:space="preserve">Si el cálculo se hizo con la agitación en rpm, en vez de porcentajes, la ganancia</w:t>
+      </w:r>
+      <w:r>
+        <w:t xml:space="preserve"> </w:t>
+      </w:r>
+      <m:oMath>
+        <m:sSub>
+          <m:e>
+            <m:r>
+              <m:t>K</m:t>
+            </m:r>
+          </m:e>
+          <m:sub>
+            <m:r>
+              <m:t>c</m:t>
+            </m:r>
+          </m:sub>
+        </m:sSub>
+      </m:oMath>
+      <w:r>
+        <w:t xml:space="preserve"> </w:t>
+      </w:r>
+      <w:r>
+        <w:t xml:space="preserve">tendrá unidades de rpm por punto de oxígeno. En ese caso el atajo es</w:t>
+      </w:r>
+      <w:r>
+        <w:t xml:space="preserve"> </w:t>
+      </w:r>
+      <m:oMath>
+        <m:sSub>
+          <m:e>
+            <m:r>
+              <m:t>X</m:t>
+            </m:r>
+          </m:e>
+          <m:sub>
+            <m:r>
+              <m:t>p</m:t>
+            </m:r>
+          </m:sub>
+        </m:sSub>
+        <m:r>
+          <m:rPr>
+            <m:sty m:val="p"/>
+          </m:rPr>
+          <m:t>=</m:t>
+        </m:r>
+        <m:r>
+          <m:rPr>
+            <m:nor/>
+            <m:sty m:val="p"/>
+          </m:rPr>
+          <m:t>Span</m:t>
+        </m:r>
+        <m:r>
+          <m:rPr>
+            <m:sty m:val="p"/>
+          </m:rPr>
+          <m:t>/</m:t>
+        </m:r>
+        <m:sSub>
+          <m:e>
+            <m:r>
+              <m:t>K</m:t>
+            </m:r>
+          </m:e>
+          <m:sub>
+            <m:r>
+              <m:t>c</m:t>
+            </m:r>
+          </m:sub>
+        </m:sSub>
+      </m:oMath>
+      <w:r>
+        <w:t xml:space="preserve">. No mezclar esa ganancia con</w:t>
+      </w:r>
+      <w:r>
+        <w:t xml:space="preserve"> </w:t>
+      </w:r>
+      <m:oMath>
+        <m:sSub>
+          <m:e>
+            <m:r>
+              <m:t>K</m:t>
+            </m:r>
+          </m:e>
+          <m:sub>
+            <m:r>
+              <m:t>c</m:t>
+            </m:r>
+            <m:r>
+              <m:rPr>
+                <m:sty m:val="p"/>
+              </m:rPr>
+              <m:t>,</m:t>
+            </m:r>
+            <m:r>
+              <m:rPr>
+                <m:nor/>
+                <m:sty m:val="p"/>
+              </m:rPr>
+              <m:t>norm</m:t>
+            </m:r>
+          </m:sub>
+        </m:sSub>
+      </m:oMath>
+      <w:r>
+        <w:t xml:space="preserve">.</w:t>
+      </w:r>
+    </w:p>
+    <w:p>
+      <w:pPr>
+        <w:pStyle w:val="BodyText"/>
+        <w:jc w:val="both"/>
+      </w:pPr>
+      <w:r>
+        <w:t xml:space="preserve">Antes de introducir valores, comprobar que la cascada usa solo agitación, sus límites reales y la escala de medición de oxígeno: si cambia el Span o la escala, cambia la conversión. La documentación de Sartorius describe</w:t>
+      </w:r>
+      <w:r>
+        <w:t xml:space="preserve"> </w:t>
+      </w:r>
+      <w:hyperlink r:id="rId28">
+        <w:r>
+          <w:rPr>
+            <w:rStyle w:val="Hyperlink"/>
+          </w:rPr>
+          <w:t xml:space="preserve">los campos XP, TI, TD y DEADB en sus controladores DCU</w:t>
+        </w:r>
+      </w:hyperlink>
+      <w:r>
+        <w:t xml:space="preserve">; los límites y la configuración concreta deben verificarse en el Biostat B de la actividad.</w:t>
+      </w:r>
+    </w:p>
+    <w:bookmarkEnd w:id="29"/>
+    <w:bookmarkStart w:id="30" w:name="organización-del-equipo"/>
+    <w:p>
+      <w:pPr>
+        <w:pStyle w:val="Heading1"/>
+        <w:jc w:val="both"/>
+      </w:pPr>
+      <w:r>
+        <w:t xml:space="preserve">8. Organización del equipo</w:t>
       </w:r>
     </w:p>
     <w:p>
@@ -5801,8 +7224,8 @@
         <w:t xml:space="preserve">revisa unidades y cálculos, registra la respuesta en automático y comparte los resultados.</w:t>
       </w:r>
     </w:p>
-    <w:bookmarkEnd w:id="27"/>
-    <w:bookmarkStart w:id="28" w:name="procedimiento-máximo-45-min-por-equipo"/>
+    <w:bookmarkEnd w:id="30"/>
+    <w:bookmarkStart w:id="31" w:name="procedimiento-máximo-45-min-por-equipo"/>
     <w:p>
       <w:pPr>
         <w:pStyle w:val="Heading1"/>
@@ -6232,7 +7655,7 @@
               <w:jc w:val="both"/>
             </w:pPr>
             <w:r>
-              <w:t xml:space="preserve">Revisar cálculos con el instructor. Introducir Xp y TI; TD = 0 s; Deadband = 1.5 %.</w:t>
+              <w:t xml:space="preserve">Revisar cálculos y sentido de acción con el instructor. Introducir Xp y TI; TD = 0 s; Deadband = 1.5 %.</w:t>
             </w:r>
           </w:p>
         </w:tc>
@@ -6441,6 +7864,47 @@
         <w:jc w:val="both"/>
       </w:pPr>
       <w:r>
+        <w:t xml:space="preserve">Antes de activar AUTO, comprobar que un déficit de oxígeno produzca una acción que aumente la agitación. Con</w:t>
+      </w:r>
+      <w:r>
+        <w:t xml:space="preserve"> </w:t>
+      </w:r>
+      <m:oMath>
+        <m:r>
+          <m:t>e</m:t>
+        </m:r>
+        <m:r>
+          <m:rPr>
+            <m:sty m:val="p"/>
+          </m:rPr>
+          <m:t>=</m:t>
+        </m:r>
+        <m:r>
+          <m:t>S</m:t>
+        </m:r>
+        <m:r>
+          <m:t>P</m:t>
+        </m:r>
+        <m:r>
+          <m:rPr>
+            <m:sty m:val="p"/>
+          </m:rPr>
+          <m:t>−</m:t>
+        </m:r>
+        <m:r>
+          <m:t>y</m:t>
+        </m:r>
+      </m:oMath>
+      <w:r>
+        <w:t xml:space="preserve">, una lectura inferior al SP da un error positivo; el sentido de acción configurado debe corregirlo.</w:t>
+      </w:r>
+    </w:p>
+    <w:p>
+      <w:pPr>
+        <w:pStyle w:val="BodyText"/>
+        <w:jc w:val="both"/>
+      </w:pPr>
+      <w:r>
         <w:rPr>
           <w:b/>
           <w:bCs/>
@@ -6511,8 +7975,8 @@
         <w:t xml:space="preserve">no calcular a partir de una curva incompleta. El instructor puede proporcionar la curva del piloto para practicar los cálculos y señalar qué datos se usaron. Si una prueba no termina antes de su límite, registrar «no se estabilizó durante el tiempo observado». La recuperación a 200 rpm puede requerir más de 10 minutos: comprobarla antes del siguiente escalón, usando una pausa entre equipos si hace falta.</w:t>
       </w:r>
     </w:p>
-    <w:bookmarkEnd w:id="28"/>
-    <w:bookmarkStart w:id="29" w:name="hoja-de-datos"/>
+    <w:bookmarkEnd w:id="31"/>
+    <w:bookmarkStart w:id="32" w:name="hoja-de-datos"/>
     <w:p>
       <w:pPr>
         <w:pStyle w:val="Heading1"/>
@@ -8909,8 +10373,8 @@
         </w:tc>
       </w:tr>
     </w:tbl>
-    <w:bookmarkEnd w:id="29"/>
-    <w:bookmarkStart w:id="30" w:name="comparación-de-los-tres-equipos"/>
+    <w:bookmarkEnd w:id="32"/>
+    <w:bookmarkStart w:id="34" w:name="comparación-de-los-tres-equipos"/>
     <w:p>
       <w:pPr>
         <w:pStyle w:val="Heading1"/>
@@ -9385,9 +10849,147 @@
           </w:p>
         </w:tc>
       </w:tr>
+      <w:tr>
+        <w:trPr>
+          <w:cantSplit/>
+          <w:trHeight w:val="454"/>
+        </w:trPr>
+        <w:tc>
+          <w:tcPr/>
+          <w:p>
+            <w:pPr>
+              <w:pStyle w:val="Compact"/>
+              <w:jc w:val="both"/>
+            </w:pPr>
+            <w:r>
+              <w:t xml:space="preserve">Intervalo final observado de pO₂ y duración [%, s]</w:t>
+            </w:r>
+          </w:p>
+        </w:tc>
+        <w:tc>
+          <w:tcPr/>
+          <w:p>
+            <w:pPr>
+              <w:pStyle w:val="Compact"/>
+              <w:jc w:val="both"/>
+            </w:pPr>
+          </w:p>
+        </w:tc>
+        <w:tc>
+          <w:tcPr/>
+          <w:p>
+            <w:pPr>
+              <w:pStyle w:val="Compact"/>
+              <w:jc w:val="both"/>
+            </w:pPr>
+          </w:p>
+        </w:tc>
+        <w:tc>
+          <w:tcPr/>
+          <w:p>
+            <w:pPr>
+              <w:pStyle w:val="Compact"/>
+              <w:jc w:val="both"/>
+            </w:pPr>
+          </w:p>
+        </w:tc>
+      </w:tr>
+      <w:tr>
+        <w:trPr>
+          <w:cantSplit/>
+          <w:trHeight w:val="454"/>
+        </w:trPr>
+        <w:tc>
+          <w:tcPr/>
+          <w:p>
+            <w:pPr>
+              <w:pStyle w:val="Compact"/>
+              <w:jc w:val="both"/>
+            </w:pPr>
+            <w:r>
+              <w:t xml:space="preserve">¿La agitación alcanzó 200 o 1200 rpm? Indicar duración</w:t>
+            </w:r>
+          </w:p>
+        </w:tc>
+        <w:tc>
+          <w:tcPr/>
+          <w:p>
+            <w:pPr>
+              <w:pStyle w:val="Compact"/>
+              <w:jc w:val="both"/>
+            </w:pPr>
+          </w:p>
+        </w:tc>
+        <w:tc>
+          <w:tcPr/>
+          <w:p>
+            <w:pPr>
+              <w:pStyle w:val="Compact"/>
+              <w:jc w:val="both"/>
+            </w:pPr>
+          </w:p>
+        </w:tc>
+        <w:tc>
+          <w:tcPr/>
+          <w:p>
+            <w:pPr>
+              <w:pStyle w:val="Compact"/>
+              <w:jc w:val="both"/>
+            </w:pPr>
+          </w:p>
+        </w:tc>
+      </w:tr>
     </w:tbl>
-    <w:bookmarkEnd w:id="30"/>
-    <w:bookmarkStart w:id="31" w:name="preguntas-para-la-discusión"/>
+    <w:p>
+      <w:pPr>
+        <w:pStyle w:val="BodyText"/>
+        <w:spacing w:before="160"/>
+        <w:jc w:val="both"/>
+      </w:pPr>
+      <w:r>
+        <w:t xml:space="preserve">La evaluación considera el mínimo por debajo de 80 % en la primera prueba y el máximo por encima de 85 % en la segunda, cuando se realice. Registrar también si las oscilaciones disminuyen, persisten o aumentan, y observar el oxígeno junto con las rpm. Una salida sostenida en un límite puede indicar que el setpoint no es alcanzable en esas condiciones.</w:t>
+      </w:r>
+    </w:p>
+    <w:p>
+      <w:pPr>
+        <w:pStyle w:val="BodyText"/>
+        <w:jc w:val="both"/>
+      </w:pPr>
+      <w:r>
+        <w:t xml:space="preserve">El tiempo de establecimiento requiere entrada y permanencia en banda hasta el final del registro observado. Si el tiempo disponible no permite confirmarlo, anotarlo. La desviación final debe interpretarse junto con la banda de observación y la zona muerta; una lectura cercana a 79 % puede estar dentro de la banda alrededor de 80 %.</w:t>
+      </w:r>
+    </w:p>
+    <w:bookmarkStart w:id="33" w:name="aplicación-a-cultivo-celular"/>
+    <w:p>
+      <w:pPr>
+        <w:pStyle w:val="Heading2"/>
+        <w:jc w:val="both"/>
+      </w:pPr>
+      <w:r>
+        <w:t xml:space="preserve">Aplicación a cultivo celular</w:t>
+      </w:r>
+    </w:p>
+    <w:p>
+      <w:pPr>
+        <w:pStyle w:val="FirstParagraph"/>
+        <w:jc w:val="both"/>
+      </w:pPr>
+      <w:r>
+        <w:t xml:space="preserve">En un cultivo CHO, la demanda de oxígeno puede cambiar con la biomasa y la etapa del cultivo. También cambian las propiedades del medio y los límites de agitación y aireación admisibles. Por ello, los parámetros obtenidos con levadura no se transfieren directamente a CHO. La interpretación debe considerar capacidad de transferencia, consumo, respuesta de la sonda, espuma y condiciones de mezcla.</w:t>
+      </w:r>
+    </w:p>
+    <w:p>
+      <w:pPr>
+        <w:pStyle w:val="BodyText"/>
+        <w:jc w:val="both"/>
+      </w:pPr>
+      <w:r>
+        <w:t xml:space="preserve">En sistemas con varios actuadores, la secuencia de agitación, caudal y enriquecimiento depende de la configuración. Conviene distinguir el controlador principal de oxígeno de los lazos que regulan cada actuador y revisar sus límites e interacciones. Esta práctica utiliza únicamente la agitación.</w:t>
+      </w:r>
+    </w:p>
+    <w:bookmarkEnd w:id="33"/>
+    <w:bookmarkEnd w:id="34"/>
+    <w:bookmarkStart w:id="35" w:name="preguntas-para-la-discusión"/>
     <w:p>
       <w:pPr>
         <w:pStyle w:val="Heading1"/>
@@ -9407,16 +11009,6 @@
         <w:jc w:val="both"/>
       </w:pPr>
       <w:r>
-        <w:rPr>
-          <w:b/>
-          <w:bCs/>
-        </w:rPr>
-        <w:t xml:space="preserve">Misma curva, distintos números.</w:t>
-      </w:r>
-      <w:r>
-        <w:t xml:space="preserve"> </w:t>
-      </w:r>
-      <w:r>
         <w:t xml:space="preserve">Los tres equipos obtuvieron un</w:t>
       </w:r>
       <w:r>
@@ -9458,16 +11050,6 @@
         <w:jc w:val="both"/>
       </w:pPr>
       <w:r>
-        <w:rPr>
-          <w:b/>
-          <w:bCs/>
-        </w:rPr>
-        <w:t xml:space="preserve">Xp contra Kc.</w:t>
-      </w:r>
-      <w:r>
-        <w:t xml:space="preserve"> </w:t>
-      </w:r>
-      <w:r>
         <w:t xml:space="preserve">Un equipo introduce por error su</w:t>
       </w:r>
       <w:r>
@@ -9517,16 +11099,6 @@
         <w:jc w:val="both"/>
       </w:pPr>
       <w:r>
-        <w:rPr>
-          <w:b/>
-          <w:bCs/>
-        </w:rPr>
-        <w:t xml:space="preserve">El Span importa.</w:t>
-      </w:r>
-      <w:r>
-        <w:t xml:space="preserve"> </w:t>
-      </w:r>
-      <w:r>
         <w:t xml:space="preserve">Si alguien supone Span = 600 rpm (cascada de 200 a 800) cuando en realidad es 1000 rpm, ¿su Xp sale más grande o más chico? ¿El controlador queda más agresivo o más suave?</w:t>
       </w:r>
     </w:p>
@@ -9540,16 +11112,6 @@
         <w:jc w:val="both"/>
       </w:pPr>
       <w:r>
-        <w:rPr>
-          <w:b/>
-          <w:bCs/>
-        </w:rPr>
-        <w:t xml:space="preserve">Alcance de la comparación.</w:t>
-      </w:r>
-      <w:r>
-        <w:t xml:space="preserve"> </w:t>
-      </w:r>
-      <w:r>
         <w:t xml:space="preserve">Con aire fijo solo probamos cambios de setpoint. ¿Por qué estas observaciones no bastan para concluir qué método rechaza mejor un cambio en el consumo de oxígeno?</w:t>
       </w:r>
     </w:p>
@@ -9563,2632 +11125,10 @@
         <w:jc w:val="both"/>
       </w:pPr>
       <w:r>
-        <w:rPr>
-          <w:b/>
-          <w:bCs/>
-        </w:rPr>
-        <w:t xml:space="preserve">Células sensibles.</w:t>
-      </w:r>
-      <w:r>
-        <w:t xml:space="preserve"> </w:t>
-      </w:r>
-      <w:r>
         <w:t xml:space="preserve">Si en lugar de levadura fueran células animales sensibles al esfuerzo de corte y a la espuma, ¿qué método elegirías y por qué?</w:t>
       </w:r>
     </w:p>
-    <w:bookmarkEnd w:id="31"/>
-    <w:bookmarkStart w:id="46" w:name="anexo-para-el-instructor"/>
-    <w:p>
-      <w:pPr>
-        <w:pStyle w:val="Heading1"/>
-        <w:pageBreakBefore/>
-        <w:jc w:val="both"/>
-      </w:pPr>
-      <w:r>
-        <w:t xml:space="preserve">Anexo para el instructor</w:t>
-      </w:r>
-    </w:p>
-    <w:bookmarkStart w:id="32" w:name="X822168b074f2151d40076ebce6c9d378750d903"/>
-    <w:p>
-      <w:pPr>
-        <w:pStyle w:val="Heading2"/>
-        <w:jc w:val="both"/>
-      </w:pPr>
-      <w:r>
-        <w:t xml:space="preserve">A. Preparar el reactor y el trabajo de los equipos</w:t>
-      </w:r>
-    </w:p>
-    <w:p>
-      <w:pPr>
-        <w:pStyle w:val="Compact"/>
-        <w:numPr>
-          <w:ilvl w:val="0"/>
-          <w:numId w:val="1010"/>
-        </w:numPr>
-        <w:jc w:val="both"/>
-      </w:pPr>
-      <w:r>
-        <w:rPr>
-          <w:b/>
-          <w:bCs/>
-        </w:rPr>
-        <w:t xml:space="preserve">Configuración común:</w:t>
-      </w:r>
-      <w:r>
-        <w:t xml:space="preserve"> </w:t>
-      </w:r>
-      <w:r>
-        <w:t xml:space="preserve">5 L de líquido, 30 °C y aire fijo a</w:t>
-      </w:r>
-      <w:r>
-        <w:t xml:space="preserve"> </w:t>
-      </w:r>
-      <w:r>
-        <w:rPr>
-          <w:b/>
-          <w:bCs/>
-        </w:rPr>
-        <w:t xml:space="preserve">0.5 vvm (2.5 L/min)</w:t>
-      </w:r>
-      <w:r>
-        <w:t xml:space="preserve"> </w:t>
-      </w:r>
-      <w:r>
-        <w:t xml:space="preserve">durante toda la actividad. Cascada de oxígeno con</w:t>
-      </w:r>
-      <w:r>
-        <w:t xml:space="preserve"> </w:t>
-      </w:r>
-      <w:r>
-        <w:rPr>
-          <w:b/>
-          <w:bCs/>
-        </w:rPr>
-        <w:t xml:space="preserve">solo agitación</w:t>
-      </w:r>
-      <w:r>
-        <w:t xml:space="preserve">, mínimo 200 y máximo 1200 rpm (Span = 1000 rpm). Verificar estos límites en pantalla antes de calcular.</w:t>
-      </w:r>
-    </w:p>
-    <w:p>
-      <w:pPr>
-        <w:pStyle w:val="Compact"/>
-        <w:numPr>
-          <w:ilvl w:val="0"/>
-          <w:numId w:val="1010"/>
-        </w:numPr>
-        <w:jc w:val="both"/>
-      </w:pPr>
-      <w:r>
-        <w:rPr>
-          <w:b/>
-          <w:bCs/>
-        </w:rPr>
-        <w:t xml:space="preserve">Preparación propuesta para el taller:</w:t>
-      </w:r>
-      <w:r>
-        <w:t xml:space="preserve"> </w:t>
-      </w:r>
-      <w:r>
-        <w:t xml:space="preserve">10 g/L de azúcar (50 g en 5 L) y 3 g/L de levadura seca (15 g). Rehidratar la levadura unos 15 min en aproximadamente 100 mL de agua tibia e inocular unos 20 min antes del primer equipo. Calibrar previamente la sonda al 100 % con aire a 30 °C.</w:t>
-      </w:r>
-    </w:p>
-    <w:p>
-      <w:pPr>
-        <w:pStyle w:val="Compact"/>
-        <w:numPr>
-          <w:ilvl w:val="0"/>
-          <w:numId w:val="1010"/>
-        </w:numPr>
-        <w:jc w:val="both"/>
-      </w:pPr>
-      <w:r>
-        <w:rPr>
-          <w:b/>
-          <w:bCs/>
-        </w:rPr>
-        <w:t xml:space="preserve">Antes de cada escalón:</w:t>
-      </w:r>
-      <w:r>
-        <w:t xml:space="preserve"> </w:t>
-      </w:r>
-      <w:r>
-        <w:t xml:space="preserve">MAN a 200 rpm, oxígeno estable y registro activo. Mantener fijos aire, temperatura y composición durante la medición. Revisar que la agitación efectivamente pase a 500 rpm.</w:t>
-      </w:r>
-    </w:p>
-    <w:p>
-      <w:pPr>
-        <w:pStyle w:val="Compact"/>
-        <w:numPr>
-          <w:ilvl w:val="0"/>
-          <w:numId w:val="1010"/>
-        </w:numPr>
-        <w:jc w:val="both"/>
-      </w:pPr>
-      <w:r>
-        <w:rPr>
-          <w:b/>
-          <w:bCs/>
-        </w:rPr>
-        <w:t xml:space="preserve">Entre equipos:</w:t>
-      </w:r>
-      <w:r>
-        <w:t xml:space="preserve"> </w:t>
-      </w:r>
-      <w:r>
-        <w:t xml:space="preserve">volver a MAN 200 rpm en el minuto 40. La recuperación observada tardó al menos 10 min; la explicación del siguiente equipo puede aprovechar parte de ese tiempo, pero no sustituye verificar estabilidad. Prever una pausa si hace falta.</w:t>
-      </w:r>
-    </w:p>
-    <w:bookmarkEnd w:id="32"/>
-    <w:bookmarkStart w:id="39" w:name="b.-qué-se-hizo-el-14-de-octubre-de-2026"/>
-    <w:p>
-      <w:pPr>
-        <w:pStyle w:val="Heading2"/>
-        <w:jc w:val="both"/>
-      </w:pPr>
-      <w:r>
-        <w:t xml:space="preserve">B. Qué se hizo el 14 de octubre de 2026</w:t>
-      </w:r>
-    </w:p>
-    <w:p>
-      <w:pPr>
-        <w:pStyle w:val="FirstParagraph"/>
-        <w:jc w:val="both"/>
-      </w:pPr>
-      <w:r>
-        <w:t xml:space="preserve">Se registraron dos escalones de</w:t>
-      </w:r>
-      <w:r>
-        <w:t xml:space="preserve"> </w:t>
-      </w:r>
-      <w:r>
-        <w:rPr>
-          <w:b/>
-          <w:bCs/>
-        </w:rPr>
-        <w:t xml:space="preserve">200 a 500 rpm</w:t>
-      </w:r>
-      <w:r>
-        <w:t xml:space="preserve"> </w:t>
-      </w:r>
-      <w:r>
-        <w:t xml:space="preserve">en el mismo lote, separados aproximadamente 30 min, en la hoja</w:t>
-      </w:r>
-      <w:r>
-        <w:t xml:space="preserve"> </w:t>
-      </w:r>
-      <w:r>
-        <w:rPr>
-          <w:rStyle w:val="VerbatimChar"/>
-        </w:rPr>
-        <w:t xml:space="preserve">B1.20261014.2</w:t>
-      </w:r>
-      <w:r>
-        <w:t xml:space="preserve"> </w:t>
-      </w:r>
-      <w:r>
-        <w:t xml:space="preserve">del Excel. Las notas del piloto indican</w:t>
-      </w:r>
-      <w:r>
-        <w:t xml:space="preserve"> </w:t>
-      </w:r>
-      <w:r>
-        <w:rPr>
-          <w:b/>
-          <w:bCs/>
-        </w:rPr>
-        <w:t xml:space="preserve">5 g/L de azúcar</w:t>
-      </w:r>
-      <w:r>
-        <w:t xml:space="preserve">; la preparación propuesta arriba usa 10 g/L. Por tanto, no presentar el piloto como una repetición con condiciones idénticas al taller. Verificar la concentración del día y anotarla.</w:t>
-      </w:r>
-    </w:p>
-    <w:p>
-      <w:pPr>
-        <w:pStyle w:val="BodyText"/>
-        <w:jc w:val="both"/>
-      </w:pPr>
-      <w:r>
-        <w:t xml:space="preserve">El cultivo evolucionó entre escalones: el oxígeno inicial bajó de 68.8 a 65.7 %. Cada equipo debe obtener su propio valor inicial y final. Las cifras siguientes son referencias para revisar cálculos o trabajar con el piloto cuando no alcance el tiempo para obtener una curva completa.</w:t>
-      </w:r>
-    </w:p>
-    <w:p>
-      <w:pPr>
-        <w:pStyle w:val="CaptionedFigure"/>
-        <w:keepNext/>
-        <w:jc w:val="center"/>
-      </w:pPr>
-      <w:r>
-        <w:drawing>
-          <wp:inline>
-            <wp:extent cx="5040000" cy="2721600"/>
-            <wp:effectExtent b="0" l="0" r="0" t="0"/>
-            <wp:docPr descr="Registro del 14 de octubre: oxígeno disuelto y agitación durante los dos escalones y las pruebas posteriores" title="" id="34" name="Picture"/>
-            <a:graphic>
-              <a:graphicData uri="http://schemas.openxmlformats.org/drawingml/2006/picture">
-                <pic:pic>
-                  <pic:nvPicPr>
-                    <pic:cNvPr descr="../figuras/05_piloto_14oct_registro.png" id="35" name="Picture"/>
-                    <pic:cNvPicPr>
-                      <a:picLocks noChangeArrowheads="1" noChangeAspect="1"/>
-                    </pic:cNvPicPr>
-                  </pic:nvPicPr>
-                  <pic:blipFill>
-                    <a:blip r:embed="rId33"/>
-                    <a:stretch>
-                      <a:fillRect/>
-                    </a:stretch>
-                  </pic:blipFill>
-                  <pic:spPr bwMode="auto">
-                    <a:xfrm>
-                      <a:off x="0" y="0"/>
-                      <a:ext cx="5040000" cy="2721600"/>
-                    </a:xfrm>
-                    <a:prstGeom prst="rect">
-                      <a:avLst/>
-                    </a:prstGeom>
-                    <a:noFill/>
-                    <a:ln w="9525">
-                      <a:noFill/>
-                      <a:headEnd/>
-                      <a:tailEnd/>
-                    </a:ln>
-                  </pic:spPr>
-                </pic:pic>
-              </a:graphicData>
-            </a:graphic>
-          </wp:inline>
-        </w:drawing>
-      </w:r>
-    </w:p>
-    <w:p>
-      <w:pPr>
-        <w:pStyle w:val="ImageCaption"/>
-        <w:keepNext w:val="0"/>
-        <w:jc w:val="center"/>
-      </w:pPr>
-      <w:r>
-        <w:t xml:space="preserve">Registro del 14 de octubre: oxígeno disuelto y agitación durante los dos escalones y las pruebas posteriores</w:t>
-      </w:r>
-    </w:p>
-    <w:p>
-      <w:pPr>
-        <w:pStyle w:val="BodyText"/>
-        <w:jc w:val="both"/>
-      </w:pPr>
-      <w:r>
-        <w:t xml:space="preserve">En esta gráfica se muestran las mediciones originales de oxígeno y agitación. El registro disponible no contiene el modo MAN/AUTO, el setpoint ni los parámetros Xp/TI: las variaciones posteriores a cada escalón deben interpretarse junto con las notas de operación, sin asignarles automáticamente un método.</w:t>
-      </w:r>
-    </w:p>
-    <w:p>
-      <w:pPr>
-        <w:pStyle w:val="CaptionedFigure"/>
-        <w:keepNext/>
-        <w:jc w:val="center"/>
-      </w:pPr>
-      <w:r>
-        <w:drawing>
-          <wp:inline>
-            <wp:extent cx="5040000" cy="3135999"/>
-            <wp:effectExtent b="0" l="0" r="0" t="0"/>
-            <wp:docPr descr="Los dos escalones del 14 de octubre alineados: respuesta de oxígeno arriba y agitación medida abajo" title="" id="37" name="Picture"/>
-            <a:graphic>
-              <a:graphicData uri="http://schemas.openxmlformats.org/drawingml/2006/picture">
-                <pic:pic>
-                  <pic:nvPicPr>
-                    <pic:cNvPr descr="../figuras/06_piloto_14oct_escalones.png" id="38" name="Picture"/>
-                    <pic:cNvPicPr>
-                      <a:picLocks noChangeArrowheads="1" noChangeAspect="1"/>
-                    </pic:cNvPicPr>
-                  </pic:nvPicPr>
-                  <pic:blipFill>
-                    <a:blip r:embed="rId36"/>
-                    <a:stretch>
-                      <a:fillRect/>
-                    </a:stretch>
-                  </pic:blipFill>
-                  <pic:spPr bwMode="auto">
-                    <a:xfrm>
-                      <a:off x="0" y="0"/>
-                      <a:ext cx="5040000" cy="3135999"/>
-                    </a:xfrm>
-                    <a:prstGeom prst="rect">
-                      <a:avLst/>
-                    </a:prstGeom>
-                    <a:noFill/>
-                    <a:ln w="9525">
-                      <a:noFill/>
-                      <a:headEnd/>
-                      <a:tailEnd/>
-                    </a:ln>
-                  </pic:spPr>
-                </pic:pic>
-              </a:graphicData>
-            </a:graphic>
-          </wp:inline>
-        </w:drawing>
-      </w:r>
-    </w:p>
-    <w:p>
-      <w:pPr>
-        <w:pStyle w:val="ImageCaption"/>
-        <w:keepNext w:val="0"/>
-        <w:jc w:val="center"/>
-      </w:pPr>
-      <w:r>
-        <w:t xml:space="preserve">Los dos escalones del 14 de octubre alineados: respuesta de oxígeno arriba y agitación medida abajo</w:t>
-      </w:r>
-    </w:p>
-    <w:p>
-      <w:pPr>
-        <w:pStyle w:val="BodyText"/>
-        <w:jc w:val="both"/>
-      </w:pPr>
-      <w:r>
-        <w:t xml:space="preserve">Ambas curvas comienzan en el instante en que cambia la agitación. Aunque el oxígeno inicial cambia, el incremento total es parecido: 23.2 y 25.3 puntos porcentuales. El escalón de 300 rpm representa 30 % de salida con el Span de 1000 rpm usado en el recálculo.</w:t>
-      </w:r>
-    </w:p>
-    <w:bookmarkEnd w:id="39"/>
-    <w:bookmarkStart w:id="43" w:name="c.-ajustes-recalculados-para-cada-método"/>
-    <w:p>
-      <w:pPr>
-        <w:pStyle w:val="Heading2"/>
-        <w:jc w:val="both"/>
-      </w:pPr>
-      <w:r>
-        <w:t xml:space="preserve">C. Ajustes recalculados para cada método</w:t>
-      </w:r>
-    </w:p>
-    <w:p>
-      <w:pPr>
-        <w:pStyle w:val="FirstParagraph"/>
-        <w:jc w:val="both"/>
-      </w:pPr>
-      <w:r>
-        <w:t xml:space="preserve">Estos resultados se obtuvieron</w:t>
-      </w:r>
-      <w:r>
-        <w:t xml:space="preserve"> </w:t>
-      </w:r>
-      <w:r>
-        <w:rPr>
-          <w:b/>
-          <w:bCs/>
-        </w:rPr>
-        <w:t xml:space="preserve">después del piloto</w:t>
-      </w:r>
-      <w:r>
-        <w:t xml:space="preserve">, leyendo las curvas con los criterios de la sección 7 y convirtiendo la ganancia con</w:t>
-      </w:r>
-      <w:r>
-        <w:t xml:space="preserve"> </w:t>
-      </w:r>
-      <w:r>
-        <w:rPr>
-          <w:b/>
-          <w:bCs/>
-        </w:rPr>
-        <w:t xml:space="preserve">Span = 1000 rpm</w:t>
-      </w:r>
-      <w:r>
-        <w:t xml:space="preserve">. Proceden del bloque</w:t>
-      </w:r>
-      <w:r>
-        <w:t xml:space="preserve"> </w:t>
-      </w:r>
-      <w:r>
-        <w:rPr>
-          <w:rStyle w:val="VerbatimChar"/>
-        </w:rPr>
-        <w:t xml:space="preserve">por_metodo</w:t>
-      </w:r>
-      <w:r>
-        <w:t xml:space="preserve"> </w:t>
-      </w:r>
-      <w:r>
-        <w:t xml:space="preserve">de los archivos de</w:t>
-      </w:r>
-      <w:r>
-        <w:t xml:space="preserve"> </w:t>
-      </w:r>
-      <w:r>
-        <w:rPr>
-          <w:rStyle w:val="VerbatimChar"/>
-        </w:rPr>
-        <w:t xml:space="preserve">resultados/</w:t>
-      </w:r>
-      <w:r>
-        <w:t xml:space="preserve">; los bloques</w:t>
-      </w:r>
-      <w:r>
-        <w:t xml:space="preserve"> </w:t>
-      </w:r>
-      <w:r>
-        <w:rPr>
-          <w:rStyle w:val="VerbatimChar"/>
-        </w:rPr>
-        <w:t xml:space="preserve">modelos</w:t>
-      </w:r>
-      <w:r>
-        <w:t xml:space="preserve"> </w:t>
-      </w:r>
-      <w:r>
-        <w:t xml:space="preserve">comparan otras estimaciones y no son los valores asignados a cada equipo.</w:t>
-      </w:r>
-    </w:p>
-    <w:tbl>
-      <w:tblPr>
-        <w:tblStyle w:val="Table"/>
-        <w:tblW w:type="pct" w:w="5000"/>
-        <w:jc w:val="center"/>
-        <w:tblBorders>
-          <w:top w:val="single" w:sz="4" w:space="0" w:color="B7AFC6"/>
-          <w:left w:val="single" w:sz="4" w:space="0" w:color="B7AFC6"/>
-          <w:bottom w:val="single" w:sz="4" w:space="0" w:color="B7AFC6"/>
-          <w:right w:val="single" w:sz="4" w:space="0" w:color="B7AFC6"/>
-          <w:insideH w:val="single" w:sz="4" w:space="0" w:color="B7AFC6"/>
-          <w:insideV w:val="single" w:sz="4" w:space="0" w:color="B7AFC6"/>
-        </w:tblBorders>
-        <w:tblLayout w:type="fixed"/>
-        <w:tblCellMar>
-          <w:top w:w="50" w:type="dxa"/>
-          <w:left w:w="100" w:type="dxa"/>
-          <w:bottom w:w="50" w:type="dxa"/>
-          <w:right w:w="100" w:type="dxa"/>
-        </w:tblCellMar>
-        <w:tblLook w:firstRow="1" w:lastRow="0" w:firstColumn="0" w:lastColumn="0" w:noHBand="0" w:noVBand="0" w:val="0020"/>
-      </w:tblPr>
-      <w:tblGrid>
-        <w:gridCol w:w="2640"/>
-        <w:gridCol w:w="2640"/>
-        <w:gridCol w:w="2640"/>
-      </w:tblGrid>
-      <w:tr>
-        <w:trPr>
-          <w:cantSplit/>
-          <w:tblHeader/>
-        </w:trPr>
-        <w:tc>
-          <w:tcPr>
-            <w:shd w:val="clear" w:color="auto" w:fill="4E2891"/>
-          </w:tcPr>
-          <w:p>
-            <w:pPr>
-              <w:pStyle w:val="Compact"/>
-              <w:jc w:val="both"/>
-            </w:pPr>
-            <w:r>
-              <w:rPr>
-                <w:b/>
-                <w:color w:val="FFFFFF"/>
-              </w:rPr>
-              <w:t xml:space="preserve">Lectura o ajuste</w:t>
-            </w:r>
-          </w:p>
-        </w:tc>
-        <w:tc>
-          <w:tcPr>
-            <w:shd w:val="clear" w:color="auto" w:fill="4E2891"/>
-          </w:tcPr>
-          <w:p>
-            <w:pPr>
-              <w:pStyle w:val="Compact"/>
-              <w:jc w:val="both"/>
-            </w:pPr>
-            <w:r>
-              <w:rPr>
-                <w:b/>
-                <w:color w:val="FFFFFF"/>
-              </w:rPr>
-              <w:t xml:space="preserve">Escalón 1</w:t>
-            </w:r>
-          </w:p>
-        </w:tc>
-        <w:tc>
-          <w:tcPr>
-            <w:shd w:val="clear" w:color="auto" w:fill="4E2891"/>
-          </w:tcPr>
-          <w:p>
-            <w:pPr>
-              <w:pStyle w:val="Compact"/>
-              <w:jc w:val="both"/>
-            </w:pPr>
-            <w:r>
-              <w:rPr>
-                <w:b/>
-                <w:color w:val="FFFFFF"/>
-              </w:rPr>
-              <w:t xml:space="preserve">Escalón 2</w:t>
-            </w:r>
-          </w:p>
-        </w:tc>
-      </w:tr>
-      <w:tr>
-        <w:trPr>
-          <w:cantSplit/>
-        </w:trPr>
-        <w:tc>
-          <w:tcPr/>
-          <w:p>
-            <w:pPr>
-              <w:pStyle w:val="Compact"/>
-              <w:jc w:val="both"/>
-            </w:pPr>
-            <w:r>
-              <w:t xml:space="preserve">Oxígeno inicial / final [%]</w:t>
-            </w:r>
-          </w:p>
-        </w:tc>
-        <w:tc>
-          <w:tcPr/>
-          <w:p>
-            <w:pPr>
-              <w:pStyle w:val="Compact"/>
-              <w:jc w:val="both"/>
-            </w:pPr>
-            <w:r>
-              <w:t xml:space="preserve">68.8 / 92.0</w:t>
-            </w:r>
-          </w:p>
-        </w:tc>
-        <w:tc>
-          <w:tcPr/>
-          <w:p>
-            <w:pPr>
-              <w:pStyle w:val="Compact"/>
-              <w:jc w:val="both"/>
-            </w:pPr>
-            <w:r>
-              <w:t xml:space="preserve">65.7 / 90.9</w:t>
-            </w:r>
-          </w:p>
-        </w:tc>
-      </w:tr>
-      <w:tr>
-        <w:trPr>
-          <w:cantSplit/>
-        </w:trPr>
-        <w:tc>
-          <w:tcPr/>
-          <w:p>
-            <w:pPr>
-              <w:pStyle w:val="Compact"/>
-              <w:jc w:val="both"/>
-            </w:pPr>
-            <w:r>
-              <w:t xml:space="preserve">Cambio de oxígeno [puntos] /</w:t>
-            </w:r>
-            <w:r>
-              <w:t xml:space="preserve"> </w:t>
-            </w:r>
-            <m:oMath>
-              <m:sSub>
-                <m:e>
-                  <m:r>
-                    <m:t>K</m:t>
-                  </m:r>
-                </m:e>
-                <m:sub>
-                  <m:r>
-                    <m:t>p</m:t>
-                  </m:r>
-                  <m:r>
-                    <m:rPr>
-                      <m:sty m:val="p"/>
-                    </m:rPr>
-                    <m:t>,</m:t>
-                  </m:r>
-                  <m:r>
-                    <m:rPr>
-                      <m:nor/>
-                      <m:sty m:val="p"/>
-                    </m:rPr>
-                    <m:t>norm</m:t>
-                  </m:r>
-                </m:sub>
-              </m:sSub>
-            </m:oMath>
-          </w:p>
-        </w:tc>
-        <w:tc>
-          <w:tcPr/>
-          <w:p>
-            <w:pPr>
-              <w:pStyle w:val="Compact"/>
-              <w:jc w:val="both"/>
-            </w:pPr>
-            <w:r>
-              <w:t xml:space="preserve">23.2 / 0.77</w:t>
-            </w:r>
-          </w:p>
-        </w:tc>
-        <w:tc>
-          <w:tcPr/>
-          <w:p>
-            <w:pPr>
-              <w:pStyle w:val="Compact"/>
-              <w:jc w:val="both"/>
-            </w:pPr>
-            <w:r>
-              <w:t xml:space="preserve">25.3 / 0.84</w:t>
-            </w:r>
-          </w:p>
-        </w:tc>
-      </w:tr>
-      <w:tr>
-        <w:trPr>
-          <w:cantSplit/>
-        </w:trPr>
-        <w:tc>
-          <w:tcPr/>
-          <w:p>
-            <w:pPr>
-              <w:pStyle w:val="Compact"/>
-              <w:jc w:val="both"/>
-            </w:pPr>
-            <w:r>
-              <w:t xml:space="preserve">Z-N:</w:t>
-            </w:r>
-            <w:r>
-              <w:t xml:space="preserve"> </w:t>
-            </w:r>
-            <m:oMath>
-              <m:r>
-                <m:t>θ</m:t>
-              </m:r>
-            </m:oMath>
-            <w:r>
-              <w:t xml:space="preserve"> </w:t>
-            </w:r>
-            <w:r>
-              <w:t xml:space="preserve">/</w:t>
-            </w:r>
-            <w:r>
-              <w:t xml:space="preserve"> </w:t>
-            </w:r>
-            <m:oMath>
-              <m:r>
-                <m:t>τ</m:t>
-              </m:r>
-            </m:oMath>
-            <w:r>
-              <w:t xml:space="preserve"> </w:t>
-            </w:r>
-            <w:r>
-              <w:t xml:space="preserve">[s]</w:t>
-            </w:r>
-          </w:p>
-        </w:tc>
-        <w:tc>
-          <w:tcPr/>
-          <w:p>
-            <w:pPr>
-              <w:pStyle w:val="Compact"/>
-              <w:jc w:val="both"/>
-            </w:pPr>
-            <w:r>
-              <w:t xml:space="preserve">18 / 96</w:t>
-            </w:r>
-          </w:p>
-        </w:tc>
-        <w:tc>
-          <w:tcPr/>
-          <w:p>
-            <w:pPr>
-              <w:pStyle w:val="Compact"/>
-              <w:jc w:val="both"/>
-            </w:pPr>
-            <w:r>
-              <w:t xml:space="preserve">18 / 85</w:t>
-            </w:r>
-          </w:p>
-        </w:tc>
-      </w:tr>
-      <w:tr>
-        <w:trPr>
-          <w:cantSplit/>
-        </w:trPr>
-        <w:tc>
-          <w:tcPr/>
-          <w:p>
-            <w:pPr>
-              <w:pStyle w:val="Compact"/>
-              <w:jc w:val="both"/>
-            </w:pPr>
-            <w:r>
-              <w:rPr>
-                <w:b/>
-                <w:bCs/>
-              </w:rPr>
-              <w:t xml:space="preserve">Z-N: Xp [%] / TI [s]</w:t>
-            </w:r>
-          </w:p>
-        </w:tc>
-        <w:tc>
-          <w:tcPr/>
-          <w:p>
-            <w:pPr>
-              <w:pStyle w:val="Compact"/>
-              <w:jc w:val="both"/>
-            </w:pPr>
-            <w:r>
-              <w:rPr>
-                <w:b/>
-                <w:bCs/>
-              </w:rPr>
-              <w:t xml:space="preserve">16.5 / 61</w:t>
-            </w:r>
-          </w:p>
-        </w:tc>
-        <w:tc>
-          <w:tcPr/>
-          <w:p>
-            <w:pPr>
-              <w:pStyle w:val="Compact"/>
-              <w:jc w:val="both"/>
-            </w:pPr>
-            <w:r>
-              <w:rPr>
-                <w:b/>
-                <w:bCs/>
-              </w:rPr>
-              <w:t xml:space="preserve">19.7 / 60</w:t>
-            </w:r>
-          </w:p>
-        </w:tc>
-      </w:tr>
-      <w:tr>
-        <w:trPr>
-          <w:cantSplit/>
-        </w:trPr>
-        <w:tc>
-          <w:tcPr/>
-          <w:p>
-            <w:pPr>
-              <w:pStyle w:val="Compact"/>
-              <w:jc w:val="both"/>
-            </w:pPr>
-            <w:r>
-              <w:t xml:space="preserve">SIMC:</w:t>
-            </w:r>
-            <w:r>
-              <w:t xml:space="preserve"> </w:t>
-            </w:r>
-            <m:oMath>
-              <m:r>
-                <m:t>θ</m:t>
-              </m:r>
-            </m:oMath>
-            <w:r>
-              <w:t xml:space="preserve"> </w:t>
-            </w:r>
-            <w:r>
-              <w:t xml:space="preserve">/</w:t>
-            </w:r>
-            <w:r>
-              <w:t xml:space="preserve"> </w:t>
-            </w:r>
-            <m:oMath>
-              <m:r>
-                <m:t>τ</m:t>
-              </m:r>
-            </m:oMath>
-            <w:r>
-              <w:t xml:space="preserve"> </w:t>
-            </w:r>
-            <w:r>
-              <w:t xml:space="preserve">[s]</w:t>
-            </w:r>
-          </w:p>
-        </w:tc>
-        <w:tc>
-          <w:tcPr/>
-          <w:p>
-            <w:pPr>
-              <w:pStyle w:val="Compact"/>
-              <w:jc w:val="both"/>
-            </w:pPr>
-            <w:r>
-              <w:t xml:space="preserve">16 / 77</w:t>
-            </w:r>
-          </w:p>
-        </w:tc>
-        <w:tc>
-          <w:tcPr/>
-          <w:p>
-            <w:pPr>
-              <w:pStyle w:val="Compact"/>
-              <w:jc w:val="both"/>
-            </w:pPr>
-            <w:r>
-              <w:t xml:space="preserve">16 / 68</w:t>
-            </w:r>
-          </w:p>
-        </w:tc>
-      </w:tr>
-      <w:tr>
-        <w:trPr>
-          <w:cantSplit/>
-        </w:trPr>
-        <w:tc>
-          <w:tcPr/>
-          <w:p>
-            <w:pPr>
-              <w:pStyle w:val="Compact"/>
-              <w:jc w:val="both"/>
-            </w:pPr>
-            <w:r>
-              <w:rPr>
-                <w:b/>
-                <w:bCs/>
-              </w:rPr>
-              <w:t xml:space="preserve">SIMC: Xp [%] / TI [s]</w:t>
-            </w:r>
-          </w:p>
-        </w:tc>
-        <w:tc>
-          <w:tcPr/>
-          <w:p>
-            <w:pPr>
-              <w:pStyle w:val="Compact"/>
-              <w:jc w:val="both"/>
-            </w:pPr>
-            <w:r>
-              <w:rPr>
-                <w:b/>
-                <w:bCs/>
-              </w:rPr>
-              <w:t xml:space="preserve">31.9 / 77</w:t>
-            </w:r>
-          </w:p>
-        </w:tc>
-        <w:tc>
-          <w:tcPr/>
-          <w:p>
-            <w:pPr>
-              <w:pStyle w:val="Compact"/>
-              <w:jc w:val="both"/>
-            </w:pPr>
-            <w:r>
-              <w:rPr>
-                <w:b/>
-                <w:bCs/>
-              </w:rPr>
-              <w:t xml:space="preserve">38.6 / 68</w:t>
-            </w:r>
-          </w:p>
-        </w:tc>
-      </w:tr>
-      <w:tr>
-        <w:trPr>
-          <w:cantSplit/>
-        </w:trPr>
-        <w:tc>
-          <w:tcPr/>
-          <w:p>
-            <w:pPr>
-              <w:pStyle w:val="Compact"/>
-              <w:jc w:val="both"/>
-            </w:pPr>
-            <w:r>
-              <w:t xml:space="preserve">ITAE:</w:t>
-            </w:r>
-            <w:r>
-              <w:t xml:space="preserve"> </w:t>
-            </w:r>
-            <m:oMath>
-              <m:r>
-                <m:t>θ</m:t>
-              </m:r>
-            </m:oMath>
-            <w:r>
-              <w:t xml:space="preserve"> </w:t>
-            </w:r>
-            <w:r>
-              <w:t xml:space="preserve">/</w:t>
-            </w:r>
-            <w:r>
-              <w:t xml:space="preserve"> </w:t>
-            </w:r>
-            <m:oMath>
-              <m:r>
-                <m:t>τ</m:t>
-              </m:r>
-            </m:oMath>
-            <w:r>
-              <w:t xml:space="preserve"> </w:t>
-            </w:r>
-            <w:r>
-              <w:t xml:space="preserve">[s]</w:t>
-            </w:r>
-          </w:p>
-        </w:tc>
-        <w:tc>
-          <w:tcPr/>
-          <w:p>
-            <w:pPr>
-              <w:pStyle w:val="Compact"/>
-              <w:jc w:val="both"/>
-            </w:pPr>
-            <w:r>
-              <w:t xml:space="preserve">22 / 71</w:t>
-            </w:r>
-          </w:p>
-        </w:tc>
-        <w:tc>
-          <w:tcPr/>
-          <w:p>
-            <w:pPr>
-              <w:pStyle w:val="Compact"/>
-              <w:jc w:val="both"/>
-            </w:pPr>
-            <w:r>
-              <w:t xml:space="preserve">22 / 61</w:t>
-            </w:r>
-          </w:p>
-        </w:tc>
-      </w:tr>
-      <w:tr>
-        <w:trPr>
-          <w:cantSplit/>
-        </w:trPr>
-        <w:tc>
-          <w:tcPr/>
-          <w:p>
-            <w:pPr>
-              <w:pStyle w:val="Compact"/>
-              <w:jc w:val="both"/>
-            </w:pPr>
-            <w:r>
-              <w:rPr>
-                <w:b/>
-                <w:bCs/>
-              </w:rPr>
-              <w:t xml:space="preserve">ITAE: Xp [%] / TI [s]</w:t>
-            </w:r>
-          </w:p>
-        </w:tc>
-        <w:tc>
-          <w:tcPr/>
-          <w:p>
-            <w:pPr>
-              <w:pStyle w:val="Compact"/>
-              <w:jc w:val="both"/>
-            </w:pPr>
-            <w:r>
-              <w:rPr>
-                <w:b/>
-                <w:bCs/>
-              </w:rPr>
-              <w:t xml:space="preserve">28.0 / 47</w:t>
-            </w:r>
-          </w:p>
-        </w:tc>
-        <w:tc>
-          <w:tcPr/>
-          <w:p>
-            <w:pPr>
-              <w:pStyle w:val="Compact"/>
-              <w:jc w:val="both"/>
-            </w:pPr>
-            <w:r>
-              <w:rPr>
-                <w:b/>
-                <w:bCs/>
-              </w:rPr>
-              <w:t xml:space="preserve">35.7 / 45</w:t>
-            </w:r>
-          </w:p>
-        </w:tc>
-      </w:tr>
-    </w:tbl>
-    <w:p>
-      <w:pPr>
-        <w:pStyle w:val="BodyText"/>
-        <w:spacing w:before="160"/>
-        <w:jc w:val="both"/>
-      </w:pPr>
-      <w:r>
-        <w:t xml:space="preserve">En todos los casos:</w:t>
-      </w:r>
-      <w:r>
-        <w:t xml:space="preserve"> </w:t>
-      </w:r>
-      <w:r>
-        <w:rPr>
-          <w:b/>
-          <w:bCs/>
-        </w:rPr>
-        <w:t xml:space="preserve">TD = 0 s</w:t>
-      </w:r>
-      <w:r>
-        <w:t xml:space="preserve"> </w:t>
-      </w:r>
-      <w:r>
-        <w:t xml:space="preserve">y</w:t>
-      </w:r>
-      <w:r>
-        <w:t xml:space="preserve"> </w:t>
-      </w:r>
-      <w:r>
-        <w:rPr>
-          <w:b/>
-          <w:bCs/>
-        </w:rPr>
-        <w:t xml:space="preserve">Deadband = 1.5 %</w:t>
-      </w:r>
-      <w:r>
-        <w:t xml:space="preserve">. No reutilizar sin comprobar los valores de Xp si cambió la configuración de la cascada.</w:t>
-      </w:r>
-    </w:p>
-    <w:p>
-      <w:pPr>
-        <w:pStyle w:val="CaptionedFigure"/>
-        <w:keepNext/>
-        <w:jc w:val="center"/>
-      </w:pPr>
-      <w:r>
-        <w:drawing>
-          <wp:inline>
-            <wp:extent cx="4500000" cy="6120000"/>
-            <wp:effectExtent b="0" l="0" r="0" t="0"/>
-            <wp:docPr descr="Lectura del segundo escalón del piloto para los tres métodos" title="" id="40" name="Picture"/>
-            <a:graphic>
-              <a:graphicData uri="http://schemas.openxmlformats.org/drawingml/2006/picture">
-                <pic:pic>
-                  <pic:nvPicPr>
-                    <pic:cNvPr descr="../figuras/12_B1.20261014.2_escalon2_criterios_vertical.png" id="41" name="Picture"/>
-                    <pic:cNvPicPr>
-                      <a:picLocks noChangeArrowheads="1" noChangeAspect="1"/>
-                    </pic:cNvPicPr>
-                  </pic:nvPicPr>
-                  <pic:blipFill>
-                    <a:blip r:embed="rId20"/>
-                    <a:stretch>
-                      <a:fillRect/>
-                    </a:stretch>
-                  </pic:blipFill>
-                  <pic:spPr bwMode="auto">
-                    <a:xfrm>
-                      <a:off x="0" y="0"/>
-                      <a:ext cx="4500000" cy="6120000"/>
-                    </a:xfrm>
-                    <a:prstGeom prst="rect">
-                      <a:avLst/>
-                    </a:prstGeom>
-                    <a:noFill/>
-                    <a:ln w="9525">
-                      <a:noFill/>
-                      <a:headEnd/>
-                      <a:tailEnd/>
-                    </a:ln>
-                  </pic:spPr>
-                </pic:pic>
-              </a:graphicData>
-            </a:graphic>
-          </wp:inline>
-        </w:drawing>
-      </w:r>
-    </w:p>
-    <w:p>
-      <w:pPr>
-        <w:pStyle w:val="ImageCaption"/>
-        <w:keepNext w:val="0"/>
-        <w:jc w:val="center"/>
-      </w:pPr>
-      <w:r>
-        <w:t xml:space="preserve">Lectura del segundo escalón del piloto para los tres métodos</w:t>
-      </w:r>
-    </w:p>
-    <w:bookmarkStart w:id="42" w:name="X1e17c9cdc837bdef2483ff2027606941c8a4064"/>
-    <w:p>
-      <w:pPr>
-        <w:pStyle w:val="Heading3"/>
-        <w:jc w:val="both"/>
-      </w:pPr>
-      <w:r>
-        <w:t xml:space="preserve">Qué revisar para que cada cálculo tenga sentido</w:t>
-      </w:r>
-    </w:p>
-    <w:tbl>
-      <w:tblPr>
-        <w:tblStyle w:val="Table"/>
-        <w:tblW w:type="pct" w:w="5000"/>
-        <w:jc w:val="center"/>
-        <w:tblBorders>
-          <w:top w:val="single" w:sz="4" w:space="0" w:color="B7AFC6"/>
-          <w:left w:val="single" w:sz="4" w:space="0" w:color="B7AFC6"/>
-          <w:bottom w:val="single" w:sz="4" w:space="0" w:color="B7AFC6"/>
-          <w:right w:val="single" w:sz="4" w:space="0" w:color="B7AFC6"/>
-          <w:insideH w:val="single" w:sz="4" w:space="0" w:color="B7AFC6"/>
-          <w:insideV w:val="single" w:sz="4" w:space="0" w:color="B7AFC6"/>
-        </w:tblBorders>
-        <w:tblLayout w:type="fixed"/>
-        <w:tblCellMar>
-          <w:top w:w="50" w:type="dxa"/>
-          <w:left w:w="100" w:type="dxa"/>
-          <w:bottom w:w="50" w:type="dxa"/>
-          <w:right w:w="100" w:type="dxa"/>
-        </w:tblCellMar>
-        <w:tblLook w:firstRow="1" w:lastRow="0" w:firstColumn="0" w:lastColumn="0" w:noHBand="0" w:noVBand="0" w:val="0020"/>
-      </w:tblPr>
-      <w:tblGrid>
-        <w:gridCol w:w="2640"/>
-        <w:gridCol w:w="2640"/>
-        <w:gridCol w:w="2640"/>
-      </w:tblGrid>
-      <w:tr>
-        <w:trPr>
-          <w:cantSplit/>
-          <w:tblHeader/>
-        </w:trPr>
-        <w:tc>
-          <w:tcPr>
-            <w:shd w:val="clear" w:color="auto" w:fill="4E2891"/>
-          </w:tcPr>
-          <w:p>
-            <w:pPr>
-              <w:pStyle w:val="Compact"/>
-              <w:jc w:val="both"/>
-            </w:pPr>
-            <w:r>
-              <w:rPr>
-                <w:b/>
-                <w:color w:val="FFFFFF"/>
-              </w:rPr>
-              <w:t xml:space="preserve">Método</w:t>
-            </w:r>
-          </w:p>
-        </w:tc>
-        <w:tc>
-          <w:tcPr>
-            <w:shd w:val="clear" w:color="auto" w:fill="4E2891"/>
-          </w:tcPr>
-          <w:p>
-            <w:pPr>
-              <w:pStyle w:val="Compact"/>
-              <w:jc w:val="both"/>
-            </w:pPr>
-            <w:r>
-              <w:rPr>
-                <w:b/>
-                <w:color w:val="FFFFFF"/>
-              </w:rPr>
-              <w:t xml:space="preserve">Comprobación de la lectura</w:t>
-            </w:r>
-          </w:p>
-        </w:tc>
-        <w:tc>
-          <w:tcPr>
-            <w:shd w:val="clear" w:color="auto" w:fill="4E2891"/>
-          </w:tcPr>
-          <w:p>
-            <w:pPr>
-              <w:pStyle w:val="Compact"/>
-              <w:jc w:val="both"/>
-            </w:pPr>
-            <w:r>
-              <w:rPr>
-                <w:b/>
-                <w:color w:val="FFFFFF"/>
-              </w:rPr>
-              <w:t xml:space="preserve">Cómo interpretar su ajuste</w:t>
-            </w:r>
-          </w:p>
-        </w:tc>
-      </w:tr>
-      <w:tr>
-        <w:trPr>
-          <w:cantSplit/>
-        </w:trPr>
-        <w:tc>
-          <w:tcPr/>
-          <w:p>
-            <w:pPr>
-              <w:pStyle w:val="Compact"/>
-              <w:jc w:val="both"/>
-            </w:pPr>
-            <w:r>
-              <w:rPr>
-                <w:b/>
-                <w:bCs/>
-              </w:rPr>
-              <w:t xml:space="preserve">Ziegler–Nichols</w:t>
-            </w:r>
-          </w:p>
-        </w:tc>
-        <w:tc>
-          <w:tcPr/>
-          <w:p>
-            <w:pPr>
-              <w:pStyle w:val="Compact"/>
-              <w:jc w:val="both"/>
-            </w:pPr>
-            <w:r>
-              <w:t xml:space="preserve">Trazar la tangente sobre el tramo de subida más pronunciado, evitando elegir un salto aislado de ruido. Medir</w:t>
-            </w:r>
-            <w:r>
-              <w:t xml:space="preserve"> </w:t>
-            </w:r>
-            <m:oMath>
-              <m:r>
-                <m:t>θ</m:t>
-              </m:r>
-            </m:oMath>
-            <w:r>
-              <w:t xml:space="preserve"> </w:t>
-            </w:r>
-            <w:r>
-              <w:t xml:space="preserve">desde el escalón al cruce inferior;</w:t>
-            </w:r>
-            <w:r>
-              <w:t xml:space="preserve"> </w:t>
-            </w:r>
-            <m:oMath>
-              <m:r>
-                <m:t>τ</m:t>
-              </m:r>
-            </m:oMath>
-            <w:r>
-              <w:t xml:space="preserve"> </w:t>
-            </w:r>
-            <w:r>
-              <w:t xml:space="preserve">es la separación entre los dos cruces.</w:t>
-            </w:r>
-          </w:p>
-        </w:tc>
-        <w:tc>
-          <w:tcPr/>
-          <w:p>
-            <w:pPr>
-              <w:pStyle w:val="Compact"/>
-              <w:jc w:val="both"/>
-            </w:pPr>
-            <w:r>
-              <w:t xml:space="preserve">Dio el Xp más pequeño: una corrección proporcional más intensa. Vigilar oscilación y límites de rpm.</w:t>
-            </w:r>
-          </w:p>
-        </w:tc>
-      </w:tr>
-      <w:tr>
-        <w:trPr>
-          <w:cantSplit/>
-        </w:trPr>
-        <w:tc>
-          <w:tcPr/>
-          <w:p>
-            <w:pPr>
-              <w:pStyle w:val="Compact"/>
-              <w:jc w:val="both"/>
-            </w:pPr>
-            <w:r>
-              <w:rPr>
-                <w:b/>
-                <w:bCs/>
-              </w:rPr>
-              <w:t xml:space="preserve">SIMC</w:t>
-            </w:r>
-          </w:p>
-        </w:tc>
-        <w:tc>
-          <w:tcPr/>
-          <w:p>
-            <w:pPr>
-              <w:pStyle w:val="Compact"/>
-              <w:jc w:val="both"/>
-            </w:pPr>
-            <w:r>
-              <w:t xml:space="preserve">Usar el inicio visible (umbral de 0.5 puntos sobre</w:t>
-            </w:r>
-            <w:r>
-              <w:t xml:space="preserve"> </w:t>
-            </w:r>
-            <m:oMath>
-              <m:sSub>
-                <m:e>
-                  <m:r>
-                    <m:t>y</m:t>
-                  </m:r>
-                </m:e>
-                <m:sub>
-                  <m:r>
-                    <m:t>0</m:t>
-                  </m:r>
-                </m:sub>
-              </m:sSub>
-            </m:oMath>
-            <w:r>
-              <w:t xml:space="preserve">) y el tiempo al 63.2 % del cambio. Restar el tiempo muerto para obtener</w:t>
-            </w:r>
-            <w:r>
-              <w:t xml:space="preserve"> </w:t>
-            </w:r>
-            <m:oMath>
-              <m:r>
-                <m:t>τ</m:t>
-              </m:r>
-            </m:oMath>
-            <w:r>
-              <w:t xml:space="preserve">. El umbral es una aproximación didáctica y es sensible al ruido.</w:t>
-            </w:r>
-          </w:p>
-        </w:tc>
-        <w:tc>
-          <w:tcPr/>
-          <w:p>
-            <w:pPr>
-              <w:pStyle w:val="Compact"/>
-              <w:jc w:val="both"/>
-            </w:pPr>
-            <w:r>
-              <w:t xml:space="preserve">Aquí se eligió</w:t>
-            </w:r>
-            <w:r>
-              <w:t xml:space="preserve"> </w:t>
-            </w:r>
-            <m:oMath>
-              <m:sSub>
-                <m:e>
-                  <m:r>
-                    <m:t>τ</m:t>
-                  </m:r>
-                </m:e>
-                <m:sub>
-                  <m:r>
-                    <m:t>c</m:t>
-                  </m:r>
-                </m:sub>
-              </m:sSub>
-              <m:r>
-                <m:rPr>
-                  <m:sty m:val="p"/>
-                </m:rPr>
-                <m:t>=</m:t>
-              </m:r>
-              <m:r>
-                <m:t>θ</m:t>
-              </m:r>
-            </m:oMath>
-            <w:r>
-              <w:t xml:space="preserve">. Un</w:t>
-            </w:r>
-            <w:r>
-              <w:t xml:space="preserve"> </w:t>
-            </w:r>
-            <m:oMath>
-              <m:sSub>
-                <m:e>
-                  <m:r>
-                    <m:t>τ</m:t>
-                  </m:r>
-                </m:e>
-                <m:sub>
-                  <m:r>
-                    <m:t>c</m:t>
-                  </m:r>
-                </m:sub>
-              </m:sSub>
-            </m:oMath>
-            <w:r>
-              <w:t xml:space="preserve"> </w:t>
-            </w:r>
-            <w:r>
-              <w:t xml:space="preserve">mayor en la regla general reduce la ganancia y permite un arranque más suave; recalcular también TI si se cambia esa elección.</w:t>
-            </w:r>
-          </w:p>
-        </w:tc>
-      </w:tr>
-      <w:tr>
-        <w:trPr>
-          <w:cantSplit/>
-        </w:trPr>
-        <w:tc>
-          <w:tcPr/>
-          <w:p>
-            <w:pPr>
-              <w:pStyle w:val="Compact"/>
-              <w:jc w:val="both"/>
-            </w:pPr>
-            <w:r>
-              <w:rPr>
-                <w:b/>
-                <w:bCs/>
-              </w:rPr>
-              <w:t xml:space="preserve">ITAE para perturbaciones</w:t>
-            </w:r>
-          </w:p>
-        </w:tc>
-        <w:tc>
-          <w:tcPr/>
-          <w:p>
-            <w:pPr>
-              <w:pStyle w:val="Compact"/>
-              <w:jc w:val="both"/>
-            </w:pPr>
-            <w:r>
-              <w:t xml:space="preserve">Leer 28.3 % y 63.2 %</w:t>
-            </w:r>
-            <w:r>
-              <w:t xml:space="preserve"> </w:t>
-            </w:r>
-            <w:r>
-              <w:rPr>
-                <w:b/>
-                <w:bCs/>
-              </w:rPr>
-              <w:t xml:space="preserve">del cambio total</w:t>
-            </w:r>
-            <w:r>
-              <w:t xml:space="preserve">, no 28.3 y 63.2 % de saturación. Ambos tiempos parten del escalón. Revisar potencias y que</w:t>
-            </w:r>
-            <w:r>
-              <w:t xml:space="preserve"> </w:t>
-            </w:r>
-            <m:oMath>
-              <m:r>
-                <m:t>θ</m:t>
-              </m:r>
-            </m:oMath>
-            <w:r>
-              <w:t xml:space="preserve"> </w:t>
-            </w:r>
-            <w:r>
-              <w:t xml:space="preserve">resulte positivo.</w:t>
-            </w:r>
-          </w:p>
-        </w:tc>
-        <w:tc>
-          <w:tcPr/>
-          <w:p>
-            <w:pPr>
-              <w:pStyle w:val="Compact"/>
-              <w:jc w:val="both"/>
-            </w:pPr>
-            <w:r>
-              <w:t xml:space="preserve">Dio un TI más corto que SIMC: la corrección integral es más rápida. Su objetivo original son perturbaciones; los cambios de setpoint del taller no verifican ese objetivo.</w:t>
-            </w:r>
-          </w:p>
-        </w:tc>
-      </w:tr>
-    </w:tbl>
-    <w:p>
-      <w:pPr>
-        <w:pStyle w:val="BodyText"/>
-        <w:spacing w:before="160"/>
-        <w:jc w:val="both"/>
-      </w:pPr>
-      <w:r>
-        <w:rPr>
-          <w:b/>
-          <w:bCs/>
-        </w:rPr>
-        <w:t xml:space="preserve">Ejemplo de revisión, segundo escalón:</w:t>
-      </w:r>
-      <w:r>
-        <w:t xml:space="preserve"> </w:t>
-      </w:r>
-      <m:oMath>
-        <m:r>
-          <m:rPr>
-            <m:sty m:val="p"/>
-          </m:rPr>
-          <m:t>Δ</m:t>
-        </m:r>
-        <m:r>
-          <m:t>y</m:t>
-        </m:r>
-        <m:r>
-          <m:rPr>
-            <m:sty m:val="p"/>
-          </m:rPr>
-          <m:t>=</m:t>
-        </m:r>
-        <m:r>
-          <m:t>25.26</m:t>
-        </m:r>
-      </m:oMath>
-      <w:r>
-        <w:t xml:space="preserve"> </w:t>
-      </w:r>
-      <w:r>
-        <w:t xml:space="preserve">puntos y</w:t>
-      </w:r>
-      <w:r>
-        <w:t xml:space="preserve"> </w:t>
-      </w:r>
-      <m:oMath>
-        <m:sSub>
-          <m:e>
-            <m:r>
-              <m:t>K</m:t>
-            </m:r>
-          </m:e>
-          <m:sub>
-            <m:r>
-              <m:t>p</m:t>
-            </m:r>
-            <m:r>
-              <m:rPr>
-                <m:sty m:val="p"/>
-              </m:rPr>
-              <m:t>,</m:t>
-            </m:r>
-            <m:r>
-              <m:rPr>
-                <m:nor/>
-                <m:sty m:val="p"/>
-              </m:rPr>
-              <m:t>norm</m:t>
-            </m:r>
-          </m:sub>
-        </m:sSub>
-        <m:r>
-          <m:rPr>
-            <m:sty m:val="p"/>
-          </m:rPr>
-          <m:t>=</m:t>
-        </m:r>
-        <m:r>
-          <m:t>25.26</m:t>
-        </m:r>
-        <m:r>
-          <m:rPr>
-            <m:sty m:val="p"/>
-          </m:rPr>
-          <m:t>/</m:t>
-        </m:r>
-        <m:r>
-          <m:t>30</m:t>
-        </m:r>
-        <m:r>
-          <m:rPr>
-            <m:sty m:val="p"/>
-          </m:rPr>
-          <m:t>=</m:t>
-        </m:r>
-        <m:r>
-          <m:t>0.842</m:t>
-        </m:r>
-      </m:oMath>
-      <w:r>
-        <w:t xml:space="preserve">. Para ITAE, los niveles son aproximadamente 72.80 y 81.62 % de saturación, alcanzados a 42.21 y 83.04 s. Así,</w:t>
-      </w:r>
-      <w:r>
-        <w:t xml:space="preserve"> </w:t>
-      </w:r>
-      <m:oMath>
-        <m:r>
-          <m:t>τ</m:t>
-        </m:r>
-        <m:r>
-          <m:rPr>
-            <m:sty m:val="p"/>
-          </m:rPr>
-          <m:t>=</m:t>
-        </m:r>
-        <m:r>
-          <m:t>1.5</m:t>
-        </m:r>
-        <m:r>
-          <m:rPr>
-            <m:sty m:val="p"/>
-          </m:rPr>
-          <m:t>(</m:t>
-        </m:r>
-        <m:r>
-          <m:t>83.04</m:t>
-        </m:r>
-        <m:r>
-          <m:rPr>
-            <m:sty m:val="p"/>
-          </m:rPr>
-          <m:t>−</m:t>
-        </m:r>
-        <m:r>
-          <m:t>42.21</m:t>
-        </m:r>
-        <m:r>
-          <m:rPr>
-            <m:sty m:val="p"/>
-          </m:rPr>
-          <m:t>)</m:t>
-        </m:r>
-        <m:r>
-          <m:rPr>
-            <m:sty m:val="p"/>
-          </m:rPr>
-          <m:t>=</m:t>
-        </m:r>
-        <m:r>
-          <m:t>61.25</m:t>
-        </m:r>
-      </m:oMath>
-      <w:r>
-        <w:t xml:space="preserve"> </w:t>
-      </w:r>
-      <w:r>
-        <w:t xml:space="preserve">s y</w:t>
-      </w:r>
-      <w:r>
-        <w:t xml:space="preserve"> </w:t>
-      </w:r>
-      <m:oMath>
-        <m:r>
-          <m:t>θ</m:t>
-        </m:r>
-        <m:r>
-          <m:rPr>
-            <m:sty m:val="p"/>
-          </m:rPr>
-          <m:t>=</m:t>
-        </m:r>
-        <m:r>
-          <m:t>83.04</m:t>
-        </m:r>
-        <m:r>
-          <m:rPr>
-            <m:sty m:val="p"/>
-          </m:rPr>
-          <m:t>−</m:t>
-        </m:r>
-        <m:r>
-          <m:t>61.25</m:t>
-        </m:r>
-        <m:r>
-          <m:rPr>
-            <m:sty m:val="p"/>
-          </m:rPr>
-          <m:t>=</m:t>
-        </m:r>
-        <m:r>
-          <m:t>21.79</m:t>
-        </m:r>
-      </m:oMath>
-      <w:r>
-        <w:t xml:space="preserve"> </w:t>
-      </w:r>
-      <w:r>
-        <w:t xml:space="preserve">s. La regla da</w:t>
-      </w:r>
-      <w:r>
-        <w:t xml:space="preserve"> </w:t>
-      </w:r>
-      <m:oMath>
-        <m:sSub>
-          <m:e>
-            <m:r>
-              <m:t>K</m:t>
-            </m:r>
-          </m:e>
-          <m:sub>
-            <m:r>
-              <m:t>c</m:t>
-            </m:r>
-            <m:r>
-              <m:rPr>
-                <m:sty m:val="p"/>
-              </m:rPr>
-              <m:t>,</m:t>
-            </m:r>
-            <m:r>
-              <m:rPr>
-                <m:nor/>
-                <m:sty m:val="p"/>
-              </m:rPr>
-              <m:t>norm</m:t>
-            </m:r>
-          </m:sub>
-        </m:sSub>
-        <m:r>
-          <m:rPr>
-            <m:sty m:val="p"/>
-          </m:rPr>
-          <m:t>=</m:t>
-        </m:r>
-        <m:r>
-          <m:t>2.80</m:t>
-        </m:r>
-      </m:oMath>
-      <w:r>
-        <w:t xml:space="preserve">, por lo que Xp = 35.7 % y TI = 45.0 s.</w:t>
-      </w:r>
-    </w:p>
-    <w:bookmarkEnd w:id="42"/>
-    <w:bookmarkEnd w:id="43"/>
-    <w:bookmarkStart w:id="44" w:name="d.-qué-se-probó-realmente-en-automático"/>
-    <w:p>
-      <w:pPr>
-        <w:pStyle w:val="Heading2"/>
-        <w:jc w:val="both"/>
-      </w:pPr>
-      <w:r>
-        <w:t xml:space="preserve">D. Qué se probó realmente en automático</w:t>
-      </w:r>
-    </w:p>
-    <w:p>
-      <w:pPr>
-        <w:pStyle w:val="FirstParagraph"/>
-        <w:jc w:val="both"/>
-      </w:pPr>
-      <w:r>
-        <w:t xml:space="preserve">Las notas de operación del 14 de octubre reportan estos ajustes con</w:t>
-      </w:r>
-      <w:r>
-        <w:t xml:space="preserve"> </w:t>
-      </w:r>
-      <w:r>
-        <w:rPr>
-          <w:b/>
-          <w:bCs/>
-        </w:rPr>
-        <w:t xml:space="preserve">SP = 80 %</w:t>
-      </w:r>
-      <w:r>
-        <w:t xml:space="preserve">:</w:t>
-      </w:r>
-    </w:p>
-    <w:tbl>
-      <w:tblPr>
-        <w:tblStyle w:val="Table"/>
-        <w:tblW w:type="pct" w:w="5000"/>
-        <w:jc w:val="center"/>
-        <w:tblBorders>
-          <w:top w:val="single" w:sz="4" w:space="0" w:color="B7AFC6"/>
-          <w:left w:val="single" w:sz="4" w:space="0" w:color="B7AFC6"/>
-          <w:bottom w:val="single" w:sz="4" w:space="0" w:color="B7AFC6"/>
-          <w:right w:val="single" w:sz="4" w:space="0" w:color="B7AFC6"/>
-          <w:insideH w:val="single" w:sz="4" w:space="0" w:color="B7AFC6"/>
-          <w:insideV w:val="single" w:sz="4" w:space="0" w:color="B7AFC6"/>
-        </w:tblBorders>
-        <w:tblLayout w:type="fixed"/>
-        <w:tblCellMar>
-          <w:top w:w="50" w:type="dxa"/>
-          <w:left w:w="100" w:type="dxa"/>
-          <w:bottom w:w="50" w:type="dxa"/>
-          <w:right w:w="100" w:type="dxa"/>
-        </w:tblCellMar>
-        <w:tblLook w:firstRow="1" w:lastRow="0" w:firstColumn="0" w:lastColumn="0" w:noHBand="0" w:noVBand="0" w:val="0020"/>
-      </w:tblPr>
-      <w:tblGrid>
-        <w:gridCol w:w="2640"/>
-        <w:gridCol w:w="2640"/>
-        <w:gridCol w:w="2640"/>
-      </w:tblGrid>
-      <w:tr>
-        <w:trPr>
-          <w:cantSplit/>
-          <w:tblHeader/>
-        </w:trPr>
-        <w:tc>
-          <w:tcPr>
-            <w:shd w:val="clear" w:color="auto" w:fill="4E2891"/>
-          </w:tcPr>
-          <w:p>
-            <w:pPr>
-              <w:pStyle w:val="Compact"/>
-              <w:jc w:val="both"/>
-            </w:pPr>
-            <w:r>
-              <w:rPr>
-                <w:b/>
-                <w:color w:val="FFFFFF"/>
-              </w:rPr>
-              <w:t xml:space="preserve">Ajuste introducido</w:t>
-            </w:r>
-          </w:p>
-        </w:tc>
-        <w:tc>
-          <w:tcPr>
-            <w:shd w:val="clear" w:color="auto" w:fill="4E2891"/>
-          </w:tcPr>
-          <w:p>
-            <w:pPr>
-              <w:pStyle w:val="Compact"/>
-              <w:jc w:val="both"/>
-            </w:pPr>
-            <w:r>
-              <w:rPr>
-                <w:b/>
-                <w:color w:val="FFFFFF"/>
-              </w:rPr>
-              <w:t xml:space="preserve">Observación anotada</w:t>
-            </w:r>
-          </w:p>
-        </w:tc>
-        <w:tc>
-          <w:tcPr>
-            <w:shd w:val="clear" w:color="auto" w:fill="4E2891"/>
-          </w:tcPr>
-          <w:p>
-            <w:pPr>
-              <w:pStyle w:val="Compact"/>
-              <w:jc w:val="both"/>
-            </w:pPr>
-            <w:r>
-              <w:rPr>
-                <w:b/>
-                <w:color w:val="FFFFFF"/>
-              </w:rPr>
-              <w:t xml:space="preserve">Qué permite concluir</w:t>
-            </w:r>
-          </w:p>
-        </w:tc>
-      </w:tr>
-      <w:tr>
-        <w:trPr>
-          <w:cantSplit/>
-        </w:trPr>
-        <w:tc>
-          <w:tcPr/>
-          <w:p>
-            <w:pPr>
-              <w:pStyle w:val="Compact"/>
-              <w:jc w:val="both"/>
-            </w:pPr>
-            <w:r>
-              <w:t xml:space="preserve">Xp = 10 %, TI = 80 s</w:t>
-            </w:r>
-          </w:p>
-        </w:tc>
-        <w:tc>
-          <w:tcPr/>
-          <w:p>
-            <w:pPr>
-              <w:pStyle w:val="Compact"/>
-              <w:jc w:val="both"/>
-            </w:pPr>
-            <w:r>
-              <w:t xml:space="preserve">Oscilación sostenida de oxígeno (aprox. 79–81.6 %) y agitación entre 200 y unas 500 rpm.</w:t>
-            </w:r>
-          </w:p>
-        </w:tc>
-        <w:tc>
-          <w:tcPr/>
-          <w:p>
-            <w:pPr>
-              <w:pStyle w:val="Compact"/>
-              <w:jc w:val="both"/>
-            </w:pPr>
-            <w:r>
-              <w:t xml:space="preserve">Ese ajuste produjo oscilación en aquellas condiciones.</w:t>
-            </w:r>
-          </w:p>
-        </w:tc>
-      </w:tr>
-      <w:tr>
-        <w:trPr>
-          <w:cantSplit/>
-        </w:trPr>
-        <w:tc>
-          <w:tcPr/>
-          <w:p>
-            <w:pPr>
-              <w:pStyle w:val="Compact"/>
-              <w:jc w:val="both"/>
-            </w:pPr>
-            <w:r>
-              <w:t xml:space="preserve">Xp = 18 %, TI = 120 s, Deadband = 1.5 %</w:t>
-            </w:r>
-          </w:p>
-        </w:tc>
-        <w:tc>
-          <w:tcPr/>
-          <w:p>
-            <w:pPr>
-              <w:pStyle w:val="Compact"/>
-              <w:jc w:val="both"/>
-            </w:pPr>
-            <w:r>
-              <w:t xml:space="preserve">Oxígeno cerca de 79 % y agitación aproximadamente constante en 307 rpm.</w:t>
-            </w:r>
-          </w:p>
-        </w:tc>
-        <w:tc>
-          <w:tcPr/>
-          <w:p>
-            <w:pPr>
-              <w:pStyle w:val="Compact"/>
-              <w:jc w:val="both"/>
-            </w:pPr>
-            <w:r>
-              <w:t xml:space="preserve">Ese ajuste resultó más estable en esa prueba. Estar cerca de 79 % es compatible con la banda de observación alrededor de 80 %.</w:t>
-            </w:r>
-          </w:p>
-        </w:tc>
-      </w:tr>
-    </w:tbl>
-    <w:p>
-      <w:pPr>
-        <w:pStyle w:val="BodyText"/>
-        <w:spacing w:before="160"/>
-        <w:jc w:val="both"/>
-      </w:pPr>
-      <w:r>
-        <w:rPr>
-          <w:b/>
-          <w:bCs/>
-        </w:rPr>
-        <w:t xml:space="preserve">Estos dos ajustes no equivalen a probar los tres métodos de la tabla anterior.</w:t>
-      </w:r>
-      <w:r>
-        <w:t xml:space="preserve"> </w:t>
-      </w:r>
-      <w:r>
-        <w:t xml:space="preserve">Durante la sesión se usaron estimaciones preliminares de</w:t>
-      </w:r>
-      <w:r>
-        <w:t xml:space="preserve"> </w:t>
-      </w:r>
-      <m:oMath>
-        <m:r>
-          <m:t>τ</m:t>
-        </m:r>
-      </m:oMath>
-      <w:r>
-        <w:t xml:space="preserve"> </w:t>
-      </w:r>
-      <w:r>
-        <w:t xml:space="preserve">a partir del tiempo de estabilización (</w:t>
-      </w:r>
-      <m:oMath>
-        <m:r>
-          <m:t>τ</m:t>
-        </m:r>
-        <m:r>
-          <m:rPr>
-            <m:sty m:val="p"/>
-          </m:rPr>
-          <m:t>≈</m:t>
-        </m:r>
-        <m:sSub>
-          <m:e>
-            <m:r>
-              <m:t>t</m:t>
-            </m:r>
-          </m:e>
-          <m:sub>
-            <m:r>
-              <m:t>s</m:t>
-            </m:r>
-          </m:sub>
-        </m:sSub>
-        <m:r>
-          <m:rPr>
-            <m:sty m:val="p"/>
-          </m:rPr>
-          <m:t>/</m:t>
-        </m:r>
-        <m:r>
-          <m:t>4</m:t>
-        </m:r>
-      </m:oMath>
-      <w:r>
-        <w:t xml:space="preserve">) y un Span supuesto de 600 rpm. El recálculo posterior usa las lecturas de las curvas y Span = 1000 rpm. Por eso</w:t>
-      </w:r>
-      <w:r>
-        <w:t xml:space="preserve"> </w:t>
-      </w:r>
-      <w:r>
-        <w:rPr>
-          <w:b/>
-          <w:bCs/>
-        </w:rPr>
-        <w:t xml:space="preserve">Xp = 18 %, TI = 120 s no debe presentarse como el resultado de SIMC</w:t>
-      </w:r>
-      <w:r>
-        <w:t xml:space="preserve">, ni como una validación experimental de los ajustes recalculados.</w:t>
-      </w:r>
-    </w:p>
-    <w:p>
-      <w:pPr>
-        <w:pStyle w:val="BodyText"/>
-        <w:jc w:val="both"/>
-      </w:pPr>
-      <w:r>
-        <w:t xml:space="preserve">Con el mismo TI y configuración, bajar Xp aumenta la acción proporcional; con el mismo Xp, bajar TI acelera la acción integral. Entre los dos ajustes ensayados cambiaron ambos parámetros, de modo que no puede atribuirse toda la diferencia a uno solo.</w:t>
-      </w:r>
-    </w:p>
-    <w:bookmarkEnd w:id="44"/>
-    <w:bookmarkStart w:id="45" w:name="X2e7ade5279b5a569cea8b8b8f2880cdd6eb0138"/>
-    <w:p>
-      <w:pPr>
-        <w:pStyle w:val="Heading2"/>
-        <w:jc w:val="both"/>
-      </w:pPr>
-      <w:r>
-        <w:t xml:space="preserve">E. Cómo comprobar y corregir el ajuste durante el taller</w:t>
-      </w:r>
-    </w:p>
-    <w:p>
-      <w:pPr>
-        <w:pStyle w:val="Compact"/>
-        <w:numPr>
-          <w:ilvl w:val="0"/>
-          <w:numId w:val="1011"/>
-        </w:numPr>
-        <w:jc w:val="both"/>
-      </w:pPr>
-      <w:r>
-        <w:rPr>
-          <w:b/>
-          <w:bCs/>
-        </w:rPr>
-        <w:t xml:space="preserve">Revisar antes de AUTO:</w:t>
-      </w:r>
-      <w:r>
-        <w:t xml:space="preserve"> </w:t>
-      </w:r>
-      <w:r>
-        <w:t xml:space="preserve">escala de oxígeno, Span real, conversión</w:t>
-      </w:r>
-      <w:r>
-        <w:t xml:space="preserve"> </w:t>
-      </w:r>
-      <m:oMath>
-        <m:sSub>
-          <m:e>
-            <m:r>
-              <m:t>X</m:t>
-            </m:r>
-          </m:e>
-          <m:sub>
-            <m:r>
-              <m:t>p</m:t>
-            </m:r>
-          </m:sub>
-        </m:sSub>
-        <m:r>
-          <m:rPr>
-            <m:sty m:val="p"/>
-          </m:rPr>
-          <m:t>=</m:t>
-        </m:r>
-        <m:r>
-          <m:t>100</m:t>
-        </m:r>
-        <m:r>
-          <m:rPr>
-            <m:sty m:val="p"/>
-          </m:rPr>
-          <m:t>/</m:t>
-        </m:r>
-        <m:sSub>
-          <m:e>
-            <m:r>
-              <m:t>K</m:t>
-            </m:r>
-          </m:e>
-          <m:sub>
-            <m:r>
-              <m:t>c</m:t>
-            </m:r>
-            <m:r>
-              <m:rPr>
-                <m:sty m:val="p"/>
-              </m:rPr>
-              <m:t>,</m:t>
-            </m:r>
-            <m:r>
-              <m:rPr>
-                <m:nor/>
-                <m:sty m:val="p"/>
-              </m:rPr>
-              <m:t>norm</m:t>
-            </m:r>
-          </m:sub>
-        </m:sSub>
-      </m:oMath>
-      <w:r>
-        <w:t xml:space="preserve">, TI en segundos, TD = 0 y setpoint alcanzable. Si la salida aumenta, la agitación debe aumentar; en esta zona de operación se espera que eso eleve el oxígeno.</w:t>
-      </w:r>
-    </w:p>
-    <w:p>
-      <w:pPr>
-        <w:pStyle w:val="Compact"/>
-        <w:numPr>
-          <w:ilvl w:val="0"/>
-          <w:numId w:val="1011"/>
-        </w:numPr>
-        <w:jc w:val="both"/>
-      </w:pPr>
-      <w:r>
-        <w:rPr>
-          <w:b/>
-          <w:bCs/>
-        </w:rPr>
-        <w:t xml:space="preserve">Empezar por el ajuste calculado y registrar qué se introdujo.</w:t>
-      </w:r>
-      <w:r>
-        <w:t xml:space="preserve"> </w:t>
-      </w:r>
-      <w:r>
-        <w:t xml:space="preserve">Observar oxígeno y rpm juntos. Registrar tiempo de entrada en la banda, si permanece ahí y si la agitación oscila o se mantiene en un límite. No prometer que una regla garantiza estabilidad.</w:t>
-      </w:r>
-    </w:p>
-    <w:p>
-      <w:pPr>
-        <w:pStyle w:val="Compact"/>
-        <w:numPr>
-          <w:ilvl w:val="0"/>
-          <w:numId w:val="1011"/>
-        </w:numPr>
-        <w:jc w:val="both"/>
-      </w:pPr>
-      <w:r>
-        <w:rPr>
-          <w:b/>
-          <w:bCs/>
-        </w:rPr>
-        <w:t xml:space="preserve">Si hay oscilación sostenida:</w:t>
-      </w:r>
-      <w:r>
-        <w:t xml:space="preserve"> </w:t>
-      </w:r>
-      <w:r>
-        <w:t xml:space="preserve">volver a MAN si no conviene continuar. Revisar primero curva, ruido, unidades y saturación. Para una nueva prueba más suave se puede aumentar Xp o aumentar TI; cambiar un parámetro a la vez, anotar el nuevo valor y dejar tiempo para observar. Es una corrección posterior, distinta del resultado original del método.</w:t>
-      </w:r>
-    </w:p>
-    <w:p>
-      <w:pPr>
-        <w:pStyle w:val="Compact"/>
-        <w:numPr>
-          <w:ilvl w:val="0"/>
-          <w:numId w:val="1011"/>
-        </w:numPr>
-        <w:jc w:val="both"/>
-      </w:pPr>
-      <w:r>
-        <w:rPr>
-          <w:b/>
-          <w:bCs/>
-        </w:rPr>
-        <w:t xml:space="preserve">Si responde demasiado lento:</w:t>
-      </w:r>
-      <w:r>
-        <w:t xml:space="preserve"> </w:t>
-      </w:r>
-      <w:r>
-        <w:t xml:space="preserve">descartar primero setpoint inalcanzable, límite de agitación o cultivo todavía cambiante. Si el problema es el ajuste, reducir Xp o TI con el instructor, de uno en uno. Mantener el aire fijo.</w:t>
-      </w:r>
-    </w:p>
-    <w:p>
-      <w:pPr>
-        <w:pStyle w:val="Compact"/>
-        <w:numPr>
-          <w:ilvl w:val="0"/>
-          <w:numId w:val="1011"/>
-        </w:numPr>
-        <w:jc w:val="both"/>
-      </w:pPr>
-      <w:r>
-        <w:rPr>
-          <w:b/>
-          <w:bCs/>
-        </w:rPr>
-        <w:t xml:space="preserve">Si queda pegado en 200 o 1200 rpm:</w:t>
-      </w:r>
-      <w:r>
-        <w:t xml:space="preserve"> </w:t>
-      </w:r>
-      <w:r>
-        <w:t xml:space="preserve">comprobar si la agitación disponible basta para llegar al setpoint. Una salida limitada no se resuelve simplemente aumentando la ganancia. Si faltan minutos, documentar la limitación y cerrar la prueba.</w:t>
-      </w:r>
-    </w:p>
-    <w:p>
-      <w:pPr>
-        <w:pStyle w:val="FirstParagraph"/>
-        <w:jc w:val="both"/>
-      </w:pPr>
-      <w:r>
-        <w:rPr>
-          <w:b/>
-          <w:bCs/>
-        </w:rPr>
-        <w:t xml:space="preserve">Aspectos del piloto que afectan la lectura:</w:t>
-      </w:r>
-      <w:r>
-        <w:t xml:space="preserve"> </w:t>
-      </w:r>
-      <w:r>
-        <w:t xml:space="preserve">el pH bajó aproximadamente de 5.8 a 4.5 y el oxígeno a 200 rpm siguió descendiendo con el tiempo. El intervalo automático fue de unos 5 s: con registro manual cada 10 s, la incertidumbre al leer un tiempo muerto de 15–22 s es apreciable. No exigir que la lectura manual reproduzca los decimales del análisis computacional.</w:t>
-      </w:r>
-    </w:p>
-    <w:p>
-      <w:pPr>
-        <w:pStyle w:val="BodyText"/>
-        <w:jc w:val="both"/>
-      </w:pPr>
-      <w:r>
-        <w:t xml:space="preserve">Si el oxígeno inicial sube inesperadamente, revisar agitación, aire, sonda y estado del cultivo. El agotamiento del azúcar es una posibilidad, no una conclusión basada solo en la señal de oxígeno. Cualquier adición cambia las condiciones: anotarla y esperar un nuevo estado estable antes de repetir el escalón.</w:t>
-      </w:r>
-    </w:p>
-    <w:bookmarkEnd w:id="45"/>
-    <w:bookmarkEnd w:id="46"/>
-    <w:bookmarkStart w:id="48" w:name="X0573fc8abedcc0dc761b708871321dcef58faf9"/>
-    <w:p>
-      <w:pPr>
-        <w:pStyle w:val="Heading1"/>
-        <w:jc w:val="both"/>
-      </w:pPr>
-      <w:r>
-        <w:t xml:space="preserve">Nota final: de las constantes del PI a los campos del Sartorius Biostat</w:t>
-      </w:r>
-    </w:p>
-    <w:p>
-      <w:pPr>
-        <w:pStyle w:val="FirstParagraph"/>
-        <w:jc w:val="both"/>
-      </w:pPr>
-      <w:r>
-        <w:t xml:space="preserve">En la configuración de esta práctica, la DCU pide</w:t>
-      </w:r>
-      <w:r>
-        <w:t xml:space="preserve"> </w:t>
-      </w:r>
-      <w:r>
-        <w:rPr>
-          <w:b/>
-          <w:bCs/>
-        </w:rPr>
-        <w:t xml:space="preserve">Xp, TI y TD</w:t>
-      </w:r>
-      <w:r>
-        <w:t xml:space="preserve">. TI es el tiempo integral en segundos y TD el derivativo (aquí, 0 s).</w:t>
-      </w:r>
-      <w:r>
-        <w:t xml:space="preserve"> </w:t>
-      </w:r>
-      <w:r>
-        <w:rPr>
-          <w:b/>
-          <w:bCs/>
-        </w:rPr>
-        <w:t xml:space="preserve">Xp es la banda proporcional</w:t>
-      </w:r>
-      <w:r>
-        <w:t xml:space="preserve">, por lo que no debemos escribir directamente la ganancia</w:t>
-      </w:r>
-      <w:r>
-        <w:t xml:space="preserve"> </w:t>
-      </w:r>
-      <m:oMath>
-        <m:sSub>
-          <m:e>
-            <m:r>
-              <m:t>K</m:t>
-            </m:r>
-          </m:e>
-          <m:sub>
-            <m:r>
-              <m:t>c</m:t>
-            </m:r>
-          </m:sub>
-        </m:sSub>
-      </m:oMath>
-      <w:r>
-        <w:t xml:space="preserve"> </w:t>
-      </w:r>
-      <w:r>
-        <w:t xml:space="preserve">en ese campo.</w:t>
-      </w:r>
-    </w:p>
-    <w:p>
-      <w:pPr>
-        <w:pStyle w:val="BodyText"/>
-        <w:jc w:val="both"/>
-      </w:pPr>
-      <w:r>
-        <w:t xml:space="preserve">Las reglas de la sección 7 usan una salida normalizada de 0 a 100 %. Con el oxígeno expresado sobre una escala de 0 a 100 % de saturación:</w:t>
-      </w:r>
-    </w:p>
-    <w:p>
-      <w:pPr>
-        <w:pStyle w:val="BodyText"/>
-        <w:keepNext w:val="0"/>
-        <w:jc w:val="center"/>
-      </w:pPr>
-      <m:oMathPara>
-        <m:oMathParaPr>
-          <m:jc m:val="center"/>
-        </m:oMathParaPr>
-        <m:oMath>
-          <m:sSub>
-            <m:e>
-              <m:r>
-                <m:t>X</m:t>
-              </m:r>
-            </m:e>
-            <m:sub>
-              <m:r>
-                <m:t>p</m:t>
-              </m:r>
-            </m:sub>
-          </m:sSub>
-          <m:r>
-            <m:rPr>
-              <m:sty m:val="p"/>
-            </m:rPr>
-            <m:t>=</m:t>
-          </m:r>
-          <m:f>
-            <m:fPr>
-              <m:type m:val="bar"/>
-            </m:fPr>
-            <m:num>
-              <m:r>
-                <m:t>100</m:t>
-              </m:r>
-            </m:num>
-            <m:den>
-              <m:sSub>
-                <m:e>
-                  <m:r>
-                    <m:t>K</m:t>
-                  </m:r>
-                </m:e>
-                <m:sub>
-                  <m:r>
-                    <m:t>c</m:t>
-                  </m:r>
-                  <m:r>
-                    <m:rPr>
-                      <m:sty m:val="p"/>
-                    </m:rPr>
-                    <m:t>,</m:t>
-                  </m:r>
-                  <m:r>
-                    <m:rPr>
-                      <m:nor/>
-                      <m:sty m:val="p"/>
-                    </m:rPr>
-                    <m:t>norm</m:t>
-                  </m:r>
-                </m:sub>
-              </m:sSub>
-            </m:den>
-          </m:f>
-        </m:oMath>
-      </m:oMathPara>
-    </w:p>
-    <w:p>
-      <w:pPr>
-        <w:pStyle w:val="FirstParagraph"/>
-        <w:jc w:val="both"/>
-      </w:pPr>
-      <w:r>
-        <w:t xml:space="preserve">Por ejemplo, si calculamos</w:t>
-      </w:r>
-      <w:r>
-        <w:t xml:space="preserve"> </w:t>
-      </w:r>
-      <m:oMath>
-        <m:sSub>
-          <m:e>
-            <m:r>
-              <m:t>K</m:t>
-            </m:r>
-          </m:e>
-          <m:sub>
-            <m:r>
-              <m:t>c</m:t>
-            </m:r>
-            <m:r>
-              <m:rPr>
-                <m:sty m:val="p"/>
-              </m:rPr>
-              <m:t>,</m:t>
-            </m:r>
-            <m:r>
-              <m:rPr>
-                <m:nor/>
-                <m:sty m:val="p"/>
-              </m:rPr>
-              <m:t>norm</m:t>
-            </m:r>
-          </m:sub>
-        </m:sSub>
-        <m:r>
-          <m:rPr>
-            <m:sty m:val="p"/>
-          </m:rPr>
-          <m:t>=</m:t>
-        </m:r>
-        <m:r>
-          <m:t>2.5</m:t>
-        </m:r>
-      </m:oMath>
-      <w:r>
-        <w:t xml:space="preserve"> </w:t>
-      </w:r>
-      <w:r>
-        <w:t xml:space="preserve">y</w:t>
-      </w:r>
-      <w:r>
-        <w:t xml:space="preserve"> </w:t>
-      </w:r>
-      <m:oMath>
-        <m:sSub>
-          <m:e>
-            <m:r>
-              <m:t>T</m:t>
-            </m:r>
-          </m:e>
-          <m:sub>
-            <m:r>
-              <m:t>I</m:t>
-            </m:r>
-          </m:sub>
-        </m:sSub>
-        <m:r>
-          <m:rPr>
-            <m:sty m:val="p"/>
-          </m:rPr>
-          <m:t>=</m:t>
-        </m:r>
-        <m:r>
-          <m:t>70</m:t>
-        </m:r>
-      </m:oMath>
-      <w:r>
-        <w:t xml:space="preserve"> </w:t>
-      </w:r>
-      <w:r>
-        <w:t xml:space="preserve">s, introducimos</w:t>
-      </w:r>
-      <w:r>
-        <w:t xml:space="preserve"> </w:t>
-      </w:r>
-      <w:r>
-        <w:rPr>
-          <w:b/>
-          <w:bCs/>
-        </w:rPr>
-        <w:t xml:space="preserve">Xp = 40 %, TI = 70 s y TD = 0 s</w:t>
-      </w:r>
-      <w:r>
-        <w:t xml:space="preserve">. Una banda Xp menor produce una corrección proporcional mayor. En ese ejemplo, un error de 4 puntos de oxígeno aporta una corrección P de 10 puntos de salida, equivalentes a 100 rpm con Span = 1000 rpm; la acción integral se suma a esa corrección.</w:t>
-      </w:r>
-    </w:p>
-    <w:p>
-      <w:pPr>
-        <w:pStyle w:val="BodyText"/>
-        <w:jc w:val="both"/>
-      </w:pPr>
-      <w:r>
-        <w:t xml:space="preserve">Si el cálculo se hizo con la agitación en rpm, en vez de porcentajes, la ganancia</w:t>
-      </w:r>
-      <w:r>
-        <w:t xml:space="preserve"> </w:t>
-      </w:r>
-      <m:oMath>
-        <m:sSub>
-          <m:e>
-            <m:r>
-              <m:t>K</m:t>
-            </m:r>
-          </m:e>
-          <m:sub>
-            <m:r>
-              <m:t>c</m:t>
-            </m:r>
-          </m:sub>
-        </m:sSub>
-      </m:oMath>
-      <w:r>
-        <w:t xml:space="preserve"> </w:t>
-      </w:r>
-      <w:r>
-        <w:t xml:space="preserve">tendrá unidades de rpm por punto de oxígeno. En ese caso el atajo es</w:t>
-      </w:r>
-      <w:r>
-        <w:t xml:space="preserve"> </w:t>
-      </w:r>
-      <m:oMath>
-        <m:sSub>
-          <m:e>
-            <m:r>
-              <m:t>X</m:t>
-            </m:r>
-          </m:e>
-          <m:sub>
-            <m:r>
-              <m:t>p</m:t>
-            </m:r>
-          </m:sub>
-        </m:sSub>
-        <m:r>
-          <m:rPr>
-            <m:sty m:val="p"/>
-          </m:rPr>
-          <m:t>=</m:t>
-        </m:r>
-        <m:r>
-          <m:rPr>
-            <m:nor/>
-            <m:sty m:val="p"/>
-          </m:rPr>
-          <m:t>Span</m:t>
-        </m:r>
-        <m:r>
-          <m:rPr>
-            <m:sty m:val="p"/>
-          </m:rPr>
-          <m:t>/</m:t>
-        </m:r>
-        <m:sSub>
-          <m:e>
-            <m:r>
-              <m:t>K</m:t>
-            </m:r>
-          </m:e>
-          <m:sub>
-            <m:r>
-              <m:t>c</m:t>
-            </m:r>
-          </m:sub>
-        </m:sSub>
-      </m:oMath>
-      <w:r>
-        <w:t xml:space="preserve">. No mezclar esa ganancia con</w:t>
-      </w:r>
-      <w:r>
-        <w:t xml:space="preserve"> </w:t>
-      </w:r>
-      <m:oMath>
-        <m:sSub>
-          <m:e>
-            <m:r>
-              <m:t>K</m:t>
-            </m:r>
-          </m:e>
-          <m:sub>
-            <m:r>
-              <m:t>c</m:t>
-            </m:r>
-            <m:r>
-              <m:rPr>
-                <m:sty m:val="p"/>
-              </m:rPr>
-              <m:t>,</m:t>
-            </m:r>
-            <m:r>
-              <m:rPr>
-                <m:nor/>
-                <m:sty m:val="p"/>
-              </m:rPr>
-              <m:t>norm</m:t>
-            </m:r>
-          </m:sub>
-        </m:sSub>
-      </m:oMath>
-      <w:r>
-        <w:t xml:space="preserve">.</w:t>
-      </w:r>
-    </w:p>
-    <w:p>
-      <w:pPr>
-        <w:pStyle w:val="BodyText"/>
-        <w:jc w:val="both"/>
-      </w:pPr>
-      <w:r>
-        <w:t xml:space="preserve">Antes de introducir valores, comprobar que la cascada usa solo agitación, sus límites reales y la escala de medición de oxígeno: si cambia el Span o la escala, cambia la conversión. La documentación de Sartorius describe</w:t>
-      </w:r>
-      <w:r>
-        <w:t xml:space="preserve"> </w:t>
-      </w:r>
-      <w:hyperlink r:id="rId47">
-        <w:r>
-          <w:rPr>
-            <w:rStyle w:val="Hyperlink"/>
-          </w:rPr>
-          <w:t xml:space="preserve">los campos XP, TI, TD y DEADB en sus controladores DCU</w:t>
-        </w:r>
-      </w:hyperlink>
-      <w:r>
-        <w:t xml:space="preserve">; los límites y la configuración concreta deben verificarse en el Biostat B de la actividad.</w:t>
-      </w:r>
-    </w:p>
-    <w:bookmarkEnd w:id="48"/>
+    <w:bookmarkEnd w:id="35"/>
     <w:sectPr>
       <w:headerReference w:type="default" r:id="rId9"/>
       <w:footerReference w:type="default" r:id="rId10"/>
@@ -12787,39 +11727,6 @@
     </w:lvlOverride>
   </w:num>
   <w:num w:numId="1009">
-    <w:abstractNumId w:val="99411"/>
-    <w:lvlOverride w:ilvl="0">
-      <w:startOverride w:val="1"/>
-    </w:lvlOverride>
-    <w:lvlOverride w:ilvl="1">
-      <w:startOverride w:val="1"/>
-    </w:lvlOverride>
-    <w:lvlOverride w:ilvl="2">
-      <w:startOverride w:val="1"/>
-    </w:lvlOverride>
-    <w:lvlOverride w:ilvl="3">
-      <w:startOverride w:val="1"/>
-    </w:lvlOverride>
-    <w:lvlOverride w:ilvl="4">
-      <w:startOverride w:val="1"/>
-    </w:lvlOverride>
-    <w:lvlOverride w:ilvl="5">
-      <w:startOverride w:val="1"/>
-    </w:lvlOverride>
-    <w:lvlOverride w:ilvl="6">
-      <w:startOverride w:val="1"/>
-    </w:lvlOverride>
-    <w:lvlOverride w:ilvl="7">
-      <w:startOverride w:val="1"/>
-    </w:lvlOverride>
-    <w:lvlOverride w:ilvl="8">
-      <w:startOverride w:val="1"/>
-    </w:lvlOverride>
-  </w:num>
-  <w:num w:numId="1010">
-    <w:abstractNumId w:val="991"/>
-  </w:num>
-  <w:num w:numId="1011">
     <w:abstractNumId w:val="99411"/>
     <w:lvlOverride w:ilvl="0">
       <w:startOverride w:val="1"/>

</xml_diff>